<commit_message>
Finalize report: 10pt font, strict question word counts, exact 6 pages
</commit_message>
<xml_diff>
--- a/Assignment1_Report_s24bcau0154_6pages.docx
+++ b/Assignment1_Report_s24bcau0154_6pages.docx
@@ -10,21 +10,21 @@
         <w:rPr>
           <w:b/>
           <w:color w:val="1E3A8A"/>
-          <w:sz w:val="28"/>
+          <w:sz w:val="30"/>
         </w:rPr>
         <w:t>CSET485 – AI and Society: Assignment #1 (10 Marks)</w:t>
       </w:r>
     </w:p>
     <w:p>
       <w:pPr>
-        <w:spacing w:after="60"/>
+        <w:spacing w:after="80"/>
       </w:pPr>
       <w:r>
         <w:rPr>
           <w:color w:val="475569"/>
-          <w:sz w:val="19"/>
+          <w:sz w:val="20"/>
         </w:rPr>
-        <w:t>Auditing Bias, Structural Confounds &amp; Fairness Defensibility in Credit Underwriting</w:t>
+        <w:t>Algorithmic Stress-Testing, Hidden Confounds &amp; Fairness Trade-Offs in Credit Underwriting</w:t>
       </w:r>
     </w:p>
     <w:tbl>
@@ -34,9 +34,9 @@
         <w:tblLook w:firstColumn="1" w:firstRow="1" w:lastColumn="0" w:lastRow="0" w:noHBand="0" w:noVBand="1" w:val="04A0"/>
       </w:tblPr>
       <w:tblGrid>
-        <w:gridCol w:w="3552"/>
-        <w:gridCol w:w="3552"/>
-        <w:gridCol w:w="3552"/>
+        <w:gridCol w:w="3504"/>
+        <w:gridCol w:w="3504"/>
+        <w:gridCol w:w="3504"/>
       </w:tblGrid>
       <w:tr>
         <w:tc>
@@ -58,13 +58,13 @@
               <w:rPr>
                 <w:b/>
                 <w:color w:val="1E40AF"/>
-                <w:sz w:val="15"/>
+                <w:sz w:val="16"/>
               </w:rPr>
               <w:t>Enrollment ID:</w:t>
             </w:r>
             <w:r>
               <w:rPr>
-                <w:sz w:val="15"/>
+                <w:sz w:val="16"/>
               </w:rPr>
               <w:t xml:space="preserve"> s24bcau0154</w:t>
             </w:r>
@@ -89,15 +89,15 @@
               <w:rPr>
                 <w:b/>
                 <w:color w:val="1E40AF"/>
-                <w:sz w:val="15"/>
+                <w:sz w:val="16"/>
               </w:rPr>
               <w:t>Assigned Dataset:</w:t>
             </w:r>
             <w:r>
               <w:rPr>
-                <w:sz w:val="15"/>
+                <w:sz w:val="16"/>
               </w:rPr>
-              <w:t xml:space="preserve"> German Credit (Last digit 4)</w:t>
+              <w:t xml:space="preserve"> German Credit Data (Statlog)</w:t>
             </w:r>
           </w:p>
         </w:tc>
@@ -120,13 +120,13 @@
               <w:rPr>
                 <w:b/>
                 <w:color w:val="1E40AF"/>
-                <w:sz w:val="15"/>
+                <w:sz w:val="16"/>
               </w:rPr>
               <w:t>Seed:</w:t>
             </w:r>
             <w:r>
               <w:rPr>
-                <w:sz w:val="15"/>
+                <w:sz w:val="16"/>
               </w:rPr>
               <w:t xml:space="preserve"> 154 (Last 3 digits)</w:t>
             </w:r>
@@ -153,13 +153,13 @@
               <w:rPr>
                 <w:b/>
                 <w:color w:val="1E40AF"/>
-                <w:sz w:val="15"/>
+                <w:sz w:val="16"/>
               </w:rPr>
               <w:t>Partition:</w:t>
             </w:r>
             <w:r>
               <w:rPr>
-                <w:sz w:val="15"/>
+                <w:sz w:val="16"/>
               </w:rPr>
               <w:t xml:space="preserve"> 70% Train (700) / 30% Test (300)</w:t>
             </w:r>
@@ -184,13 +184,13 @@
               <w:rPr>
                 <w:b/>
                 <w:color w:val="1E40AF"/>
-                <w:sz w:val="15"/>
+                <w:sz w:val="16"/>
               </w:rPr>
               <w:t>Target:</w:t>
             </w:r>
             <w:r>
               <w:rPr>
-                <w:sz w:val="15"/>
+                <w:sz w:val="16"/>
               </w:rPr>
               <w:t xml:space="preserve"> Approval (1=Approve, 0=Reject)</w:t>
             </w:r>
@@ -215,13 +215,13 @@
               <w:rPr>
                 <w:b/>
                 <w:color w:val="1E40AF"/>
-                <w:sz w:val="15"/>
+                <w:sz w:val="16"/>
               </w:rPr>
               <w:t>Reproducibility:</w:t>
             </w:r>
             <w:r>
               <w:rPr>
-                <w:sz w:val="15"/>
+                <w:sz w:val="16"/>
               </w:rPr>
               <w:t xml:space="preserve"> Full Jupyter Notebook</w:t>
             </w:r>
@@ -231,64 +231,64 @@
     </w:tbl>
     <w:p>
       <w:pPr>
-        <w:spacing w:before="60" w:after="60"/>
+        <w:spacing w:before="80" w:after="80"/>
       </w:pPr>
       <w:r>
         <w:rPr>
           <w:b/>
         </w:rPr>
-        <w:t xml:space="preserve">Executive Summary: </w:t>
+        <w:t xml:space="preserve">Objective: </w:t>
       </w:r>
       <w:r>
-        <w:t>Algorithmic underwriting systems often appear statistically robust while masking demographic disparities, omitted confounders, and unavoidable fairness trade-offs. Using the German Credit dataset (N=1,000), we stress-test Linear Probability OLS and Logistic Regression across threshold mismatches, Simpson's paradox, omitted-variable bias, adversarial failure clusters, and parametric fairness frontiers. All findings are grounded strictly in our computed numbers.</w:t>
+        <w:t>High-stakes predictive algorithms in credit lending frequently appear statistically sound while concealing demographic disparities, severe omitted-variable bias, and irreconcilable fairness trade-offs. Using the German Credit dataset (N=1,000), this report stress-tests Linear OLS and Logistic Regression across threshold mismatches, Simpson's paradox, omitted-variable bias, adversarial failure clusters, and parametric fairness frontiers. All conclusions directly reference our computed numbers.</w:t>
       </w:r>
     </w:p>
     <w:p>
       <w:pPr>
         <w:keepNext/>
-        <w:spacing w:before="120" w:after="40"/>
+        <w:spacing w:before="140" w:after="40"/>
       </w:pPr>
       <w:r>
         <w:rPr>
           <w:b/>
           <w:color w:val="1E3A8A"/>
-          <w:sz w:val="21"/>
+          <w:sz w:val="22"/>
         </w:rPr>
         <w:t>Data Preprocessing &amp; Exploratory Audit</w:t>
       </w:r>
     </w:p>
     <w:p>
       <w:r>
-        <w:t>1. Missing Values: Programmatic scan confirmed 0 missing values across all 1,000 instances and 20 features.</w:t>
+        <w:t>1. Missing Values: Verified exactly 0 missing values across all 1,000 instances and 20 features, conforming to documentation.</w:t>
         <w:br/>
-        <w:t>2. Categorical Feature Encoding: 13 qualitative features were encoded via One-Hot Encoding dropping the first category (drop_first=True) to eliminate multicollinearity and dummy variable traps, yielding 41 indicator columns and 7 continuous regressors (48 total modeled predictors).</w:t>
+        <w:t>2. Categorical Encoding: 13 qualitative features were encoded via One-Hot Encoding dropping the first category (drop_first=True) to avoid multicollinearity and dummy variable traps, yielding 41 indicator columns and 7 continuous regressors (48 total modeled predictors).</w:t>
         <w:br/>
-        <w:t>3. Feature Scaling: Standardized all 7 continuous features (duration, credit_amount, installment_commitment, residence_since, age, existing_credits, num_dependents) with StandardScaler fit strictly on the 70% train split (N=700, seed=154) to eliminate data leakage.</w:t>
+        <w:t>3. Feature Scaling: Standardized all 7 continuous features (duration, credit_amount, installment_commitment, residence_since, age, existing_credits, num_dependents) using StandardScaler fit strictly on the 70% training split (N=700, seed=154) to eliminate data leakage.</w:t>
         <w:br/>
-        <w:t>4. Outlier Handling Rationale: 70 outliers in duration (7.0%), 72 in credit_amount (7.2%), and 23 in age (2.3%) were identified via the 1.5 x IQR rule. These were deliberately preserved without clipping; high balances and long loan maturities represent legitimate tail-risk default liabilities that models must learn.</w:t>
+        <w:t>4. Outlier Rationale: Identified 70 outliers in duration (7.0%), 72 in credit_amount (7.2%), and 23 in age (2.3%) via the 1.5 x IQR rule. These were deliberately preserved without clipping; high balances and long maturities represent legitimate tail-risk default liabilities that underwriting models must learn.</w:t>
       </w:r>
     </w:p>
     <w:p>
       <w:pPr>
         <w:keepNext/>
-        <w:spacing w:before="120" w:after="40"/>
+        <w:spacing w:before="140" w:after="40"/>
       </w:pPr>
       <w:r>
         <w:rPr>
           <w:b/>
           <w:color w:val="1E3A8A"/>
-          <w:sz w:val="21"/>
+          <w:sz w:val="22"/>
         </w:rPr>
         <w:t>Part 1 — Model Fitting &amp; Threshold Mismatch Analysis</w:t>
       </w:r>
     </w:p>
     <w:p>
       <w:r>
-        <w:t>Both models were fitted on the 700-sample training matrix (train base rate: 69.71%, test base rate: 70.67%):</w:t>
+        <w:t>Both models were fitted on the identical 700-sample training matrix (train approval base rate: 69.71%, test base rate: 70.67%):</w:t>
         <w:br/>
-        <w:t>• Model A (Linear OLS Regression): Continuous predictions Y_hat on test set range in [-0.0211, 1.3459] with an empirical median of 0.7151. Mandating the threshold at the median (Y_hat &gt;= 0.7151) classifies exactly 150 instances (50.0%) as positive.</w:t>
+        <w:t>• Model A (Linear OLS Regression): Continuous predictions Y_hat on the test set range from -0.0211 to 1.3459 with an empirical median of 0.7151. Thresholding at median (Y_hat &gt;= 0.7151) classifies exactly 150 instances (50.0%) as positive.</w:t>
         <w:br/>
-        <w:t>• Model B (Logistic Regression): Sigmoidal probabilities P_hat range in [0.0628, 0.9946]. Thresholding at standard P_hat &gt;= 0.50 classifies 240 instances (80.0%) as positive. Overall test accuracy: Model B = 75.33% vs. Model A = 68.00%.</w:t>
+        <w:t>• Model B (Logistic Regression): Sigmoidal probabilities P_hat range in [0.0628, 0.9946]. Thresholding at standard P_hat &gt;= 0.50 classifies 240 instances (80.0%) as positive. Test accuracy: Model B = 75.33% vs. Model A = 68.00%.</w:t>
       </w:r>
     </w:p>
     <w:tbl>
@@ -298,15 +298,15 @@
         <w:tblLook w:firstColumn="1" w:firstRow="1" w:lastColumn="0" w:lastRow="0" w:noHBand="0" w:noVBand="1" w:val="04A0"/>
       </w:tblPr>
       <w:tblGrid>
-        <w:gridCol w:w="2664"/>
-        <w:gridCol w:w="2664"/>
-        <w:gridCol w:w="2664"/>
-        <w:gridCol w:w="2664"/>
+        <w:gridCol w:w="2628"/>
+        <w:gridCol w:w="2628"/>
+        <w:gridCol w:w="2628"/>
+        <w:gridCol w:w="2628"/>
       </w:tblGrid>
       <w:tr>
         <w:tc>
           <w:tcPr>
-            <w:tcW w:type="dxa" w:w="2664"/>
+            <w:tcW w:type="dxa" w:w="2628"/>
             <w:shd w:fill="1E3A8A"/>
             <w:tcMar>
               <w:top w:w="40" w:type="dxa"/>
@@ -323,15 +323,15 @@
               <w:rPr>
                 <w:b/>
                 <w:color w:val="FFFFFF"/>
-                <w:sz w:val="15"/>
+                <w:sz w:val="16"/>
               </w:rPr>
-              <w:t>Classification Matrix</w:t>
+              <w:t>Classification Alignment</w:t>
             </w:r>
           </w:p>
         </w:tc>
         <w:tc>
           <w:tcPr>
-            <w:tcW w:type="dxa" w:w="2664"/>
+            <w:tcW w:type="dxa" w:w="2628"/>
             <w:shd w:fill="1E3A8A"/>
             <w:tcMar>
               <w:top w:w="40" w:type="dxa"/>
@@ -348,7 +348,7 @@
               <w:rPr>
                 <w:b/>
                 <w:color w:val="FFFFFF"/>
-                <w:sz w:val="15"/>
+                <w:sz w:val="16"/>
               </w:rPr>
               <w:t>Model A Negative (&lt; Median)</w:t>
             </w:r>
@@ -356,7 +356,7 @@
         </w:tc>
         <w:tc>
           <w:tcPr>
-            <w:tcW w:type="dxa" w:w="2664"/>
+            <w:tcW w:type="dxa" w:w="2628"/>
             <w:shd w:fill="1E3A8A"/>
             <w:tcMar>
               <w:top w:w="40" w:type="dxa"/>
@@ -373,7 +373,7 @@
               <w:rPr>
                 <w:b/>
                 <w:color w:val="FFFFFF"/>
-                <w:sz w:val="15"/>
+                <w:sz w:val="16"/>
               </w:rPr>
               <w:t>Model A Positive (&gt;= Median 0.7151)</w:t>
             </w:r>
@@ -381,7 +381,7 @@
         </w:tc>
         <w:tc>
           <w:tcPr>
-            <w:tcW w:type="dxa" w:w="2664"/>
+            <w:tcW w:type="dxa" w:w="2628"/>
             <w:shd w:fill="1E3A8A"/>
             <w:tcMar>
               <w:top w:w="40" w:type="dxa"/>
@@ -398,7 +398,7 @@
               <w:rPr>
                 <w:b/>
                 <w:color w:val="FFFFFF"/>
-                <w:sz w:val="15"/>
+                <w:sz w:val="16"/>
               </w:rPr>
               <w:t>Total Model B</w:t>
             </w:r>
@@ -408,7 +408,7 @@
       <w:tr>
         <w:tc>
           <w:tcPr>
-            <w:tcW w:type="dxa" w:w="2664"/>
+            <w:tcW w:type="dxa" w:w="2628"/>
             <w:tcMar>
               <w:top w:w="35" w:type="dxa"/>
               <w:bottom w:w="35" w:type="dxa"/>
@@ -422,7 +422,7 @@
             </w:pPr>
             <w:r>
               <w:rPr>
-                <w:sz w:val="15"/>
+                <w:sz w:val="16"/>
               </w:rPr>
               <w:t>Model B Negative (&lt; 0.50)</w:t>
             </w:r>
@@ -430,7 +430,7 @@
         </w:tc>
         <w:tc>
           <w:tcPr>
-            <w:tcW w:type="dxa" w:w="2664"/>
+            <w:tcW w:type="dxa" w:w="2628"/>
             <w:tcMar>
               <w:top w:w="35" w:type="dxa"/>
               <w:bottom w:w="35" w:type="dxa"/>
@@ -444,7 +444,7 @@
             </w:pPr>
             <w:r>
               <w:rPr>
-                <w:sz w:val="15"/>
+                <w:sz w:val="16"/>
               </w:rPr>
               <w:t>60 (True Agreement)</w:t>
             </w:r>
@@ -452,7 +452,7 @@
         </w:tc>
         <w:tc>
           <w:tcPr>
-            <w:tcW w:type="dxa" w:w="2664"/>
+            <w:tcW w:type="dxa" w:w="2628"/>
             <w:tcMar>
               <w:top w:w="35" w:type="dxa"/>
               <w:bottom w:w="35" w:type="dxa"/>
@@ -466,7 +466,7 @@
             </w:pPr>
             <w:r>
               <w:rPr>
-                <w:sz w:val="15"/>
+                <w:sz w:val="16"/>
               </w:rPr>
               <w:t>0</w:t>
             </w:r>
@@ -474,7 +474,7 @@
         </w:tc>
         <w:tc>
           <w:tcPr>
-            <w:tcW w:type="dxa" w:w="2664"/>
+            <w:tcW w:type="dxa" w:w="2628"/>
             <w:tcMar>
               <w:top w:w="35" w:type="dxa"/>
               <w:bottom w:w="35" w:type="dxa"/>
@@ -488,7 +488,7 @@
             </w:pPr>
             <w:r>
               <w:rPr>
-                <w:sz w:val="15"/>
+                <w:sz w:val="16"/>
               </w:rPr>
               <w:t>60 (20.0%)</w:t>
             </w:r>
@@ -498,7 +498,7 @@
       <w:tr>
         <w:tc>
           <w:tcPr>
-            <w:tcW w:type="dxa" w:w="2664"/>
+            <w:tcW w:type="dxa" w:w="2628"/>
             <w:shd w:fill="F8FAFC"/>
             <w:tcMar>
               <w:top w:w="35" w:type="dxa"/>
@@ -513,7 +513,7 @@
             </w:pPr>
             <w:r>
               <w:rPr>
-                <w:sz w:val="15"/>
+                <w:sz w:val="16"/>
               </w:rPr>
               <w:t>Model B Positive (&gt;= 0.50)</w:t>
             </w:r>
@@ -521,7 +521,7 @@
         </w:tc>
         <w:tc>
           <w:tcPr>
-            <w:tcW w:type="dxa" w:w="2664"/>
+            <w:tcW w:type="dxa" w:w="2628"/>
             <w:shd w:fill="FEE2E2"/>
             <w:tcMar>
               <w:top w:w="35" w:type="dxa"/>
@@ -537,15 +537,15 @@
             <w:r>
               <w:rPr>
                 <w:b/>
-                <w:sz w:val="15"/>
+                <w:sz w:val="16"/>
               </w:rPr>
-              <w:t>90 (Mismatched Cases: 30.0%)</w:t>
+              <w:t>90 (Mismatched: 30.0%)</w:t>
             </w:r>
           </w:p>
         </w:tc>
         <w:tc>
           <w:tcPr>
-            <w:tcW w:type="dxa" w:w="2664"/>
+            <w:tcW w:type="dxa" w:w="2628"/>
             <w:shd w:fill="F8FAFC"/>
             <w:tcMar>
               <w:top w:w="35" w:type="dxa"/>
@@ -560,7 +560,7 @@
             </w:pPr>
             <w:r>
               <w:rPr>
-                <w:sz w:val="15"/>
+                <w:sz w:val="16"/>
               </w:rPr>
               <w:t>150 (True Agreement)</w:t>
             </w:r>
@@ -568,7 +568,7 @@
         </w:tc>
         <w:tc>
           <w:tcPr>
-            <w:tcW w:type="dxa" w:w="2664"/>
+            <w:tcW w:type="dxa" w:w="2628"/>
             <w:shd w:fill="F8FAFC"/>
             <w:tcMar>
               <w:top w:w="35" w:type="dxa"/>
@@ -583,7 +583,7 @@
             </w:pPr>
             <w:r>
               <w:rPr>
-                <w:sz w:val="15"/>
+                <w:sz w:val="16"/>
               </w:rPr>
               <w:t>240 (80.0%)</w:t>
             </w:r>
@@ -593,7 +593,7 @@
     </w:tbl>
     <w:p>
       <w:r>
-        <w:t>Key Mechanism: Exactly 90 out of 300 individuals (30.00%) are mismatched. Model A forces a relative rank median split (50/50), discarding qualified borrowers in the corridor 0.5000 &lt;= P_hat_B &lt; 0.7151, while Model B reflects the true 70.67% base rate.</w:t>
+        <w:t>Mechanism: Exactly 90 out of 300 individuals (30.00%) are mismatched. Model A forces a relative rank median split (50/50), rejecting qualified borrowers in the corridor 0.5000 &lt;= P_hat_B &lt; 0.7151, while Model B reflects the true 70.67% base rate.</w:t>
       </w:r>
     </w:p>
     <w:p>
@@ -604,7 +604,7 @@
       <w:r>
         <w:drawing>
           <wp:inline xmlns:a="http://schemas.openxmlformats.org/drawingml/2006/main" xmlns:pic="http://schemas.openxmlformats.org/drawingml/2006/picture">
-            <wp:extent cx="4389120" cy="1567543"/>
+            <wp:extent cx="4206240" cy="1502229"/>
             <wp:docPr id="1" name="Picture 1"/>
             <wp:cNvGraphicFramePr>
               <a:graphicFrameLocks noChangeAspect="1"/>
@@ -625,7 +625,7 @@
                   <pic:spPr>
                     <a:xfrm>
                       <a:off x="0" y="0"/>
-                      <a:ext cx="4389120" cy="1567543"/>
+                      <a:ext cx="4206240" cy="1502229"/>
                     </a:xfrm>
                     <a:prstGeom prst="rect"/>
                   </pic:spPr>
@@ -644,20 +644,20 @@
     <w:p>
       <w:pPr>
         <w:keepNext/>
-        <w:spacing w:before="120" w:after="40"/>
+        <w:spacing w:before="140" w:after="40"/>
       </w:pPr>
       <w:r>
         <w:rPr>
           <w:b/>
           <w:color w:val="1E3A8A"/>
-          <w:sz w:val="21"/>
+          <w:sz w:val="22"/>
         </w:rPr>
         <w:t>Part 2.1 — Simpson's Paradox Hunt</w:t>
       </w:r>
     </w:p>
     <w:p>
       <w:r>
-        <w:t>1. Sign Reversal on Existing Credits across Age: In the full population (N=1,000), bivariate logistic regression indicates existing credits increase approval odds (beta = +0.1780). Disaggregating by age reveals an acute sign reversal: for Young Adults (&lt;30, N=371), beta reverses to negative (beta = -0.2203), whereas for Mature Adults (&gt;=30, N=629), it is strongly positive (beta = +0.3083, p = 0.0519). For young borrowers, multiple loans signal emergency borrowing and liquidity distress; for mature adults, they reflect seasoned credit history.</w:t>
+        <w:t>1. Sign Reversal on Existing Credits across Age: In the full population (N=1,000), bivariate logistic regression indicates that existing credits increase approval odds (beta = +0.1780). Disaggregating by age reveals an acute sign reversal: for Young Adults (&lt;30, N=371), the coefficient reverses to negative (beta = -0.2203), while for Mature Adults (&gt;=30, N=629), it is strongly positive (beta = +0.3083, p = 0.0519). For young borrowers, multiple loans signal emergency borrowing and liquidity distress; for mature adults, they reflect established credit history.</w:t>
         <w:br/>
         <w:t>2. Age Divergence across Gender: In standardized multivariable regression, applicant age has zero statistical impact on men (beta_Male = +0.0604, p = 0.5204), but acts as an enormous protective factor for women (beta_Female = +0.4741, p = 0.0013)—an effect size nearly eight times larger.</w:t>
       </w:r>
@@ -669,17 +669,17 @@
         <w:tblLook w:firstColumn="1" w:firstRow="1" w:lastColumn="0" w:lastRow="0" w:noHBand="0" w:noVBand="1" w:val="04A0"/>
       </w:tblPr>
       <w:tblGrid>
-        <w:gridCol w:w="1776"/>
-        <w:gridCol w:w="1776"/>
-        <w:gridCol w:w="1776"/>
-        <w:gridCol w:w="1776"/>
-        <w:gridCol w:w="1776"/>
-        <w:gridCol w:w="1776"/>
+        <w:gridCol w:w="1752"/>
+        <w:gridCol w:w="1752"/>
+        <w:gridCol w:w="1752"/>
+        <w:gridCol w:w="1752"/>
+        <w:gridCol w:w="1752"/>
+        <w:gridCol w:w="1752"/>
       </w:tblGrid>
       <w:tr>
         <w:tc>
           <w:tcPr>
-            <w:tcW w:type="dxa" w:w="1776"/>
+            <w:tcW w:type="dxa" w:w="1752"/>
             <w:shd w:fill="1E3A8A"/>
             <w:tcMar>
               <w:top w:w="40" w:type="dxa"/>
@@ -696,15 +696,15 @@
               <w:rPr>
                 <w:b/>
                 <w:color w:val="FFFFFF"/>
-                <w:sz w:val="15"/>
+                <w:sz w:val="16"/>
               </w:rPr>
-              <w:t>Subgroup Analysis</w:t>
+              <w:t>Cohort / Subgroup</w:t>
             </w:r>
           </w:p>
         </w:tc>
         <w:tc>
           <w:tcPr>
-            <w:tcW w:type="dxa" w:w="1776"/>
+            <w:tcW w:type="dxa" w:w="1752"/>
             <w:shd w:fill="1E3A8A"/>
             <w:tcMar>
               <w:top w:w="40" w:type="dxa"/>
@@ -721,7 +721,7 @@
               <w:rPr>
                 <w:b/>
                 <w:color w:val="FFFFFF"/>
-                <w:sz w:val="15"/>
+                <w:sz w:val="16"/>
               </w:rPr>
               <w:t>N</w:t>
             </w:r>
@@ -729,7 +729,7 @@
         </w:tc>
         <w:tc>
           <w:tcPr>
-            <w:tcW w:type="dxa" w:w="1776"/>
+            <w:tcW w:type="dxa" w:w="1752"/>
             <w:shd w:fill="1E3A8A"/>
             <w:tcMar>
               <w:top w:w="40" w:type="dxa"/>
@@ -746,7 +746,7 @@
               <w:rPr>
                 <w:b/>
                 <w:color w:val="FFFFFF"/>
-                <w:sz w:val="15"/>
+                <w:sz w:val="16"/>
               </w:rPr>
               <w:t>Coef (beta)</w:t>
             </w:r>
@@ -754,7 +754,7 @@
         </w:tc>
         <w:tc>
           <w:tcPr>
-            <w:tcW w:type="dxa" w:w="1776"/>
+            <w:tcW w:type="dxa" w:w="1752"/>
             <w:shd w:fill="1E3A8A"/>
             <w:tcMar>
               <w:top w:w="40" w:type="dxa"/>
@@ -771,7 +771,7 @@
               <w:rPr>
                 <w:b/>
                 <w:color w:val="FFFFFF"/>
-                <w:sz w:val="15"/>
+                <w:sz w:val="16"/>
               </w:rPr>
               <w:t>Std. Error</w:t>
             </w:r>
@@ -779,7 +779,7 @@
         </w:tc>
         <w:tc>
           <w:tcPr>
-            <w:tcW w:type="dxa" w:w="1776"/>
+            <w:tcW w:type="dxa" w:w="1752"/>
             <w:shd w:fill="1E3A8A"/>
             <w:tcMar>
               <w:top w:w="40" w:type="dxa"/>
@@ -796,7 +796,7 @@
               <w:rPr>
                 <w:b/>
                 <w:color w:val="FFFFFF"/>
-                <w:sz w:val="15"/>
+                <w:sz w:val="16"/>
               </w:rPr>
               <w:t>p-value</w:t>
             </w:r>
@@ -804,7 +804,7 @@
         </w:tc>
         <w:tc>
           <w:tcPr>
-            <w:tcW w:type="dxa" w:w="1776"/>
+            <w:tcW w:type="dxa" w:w="1752"/>
             <w:shd w:fill="1E3A8A"/>
             <w:tcMar>
               <w:top w:w="40" w:type="dxa"/>
@@ -821,7 +821,7 @@
               <w:rPr>
                 <w:b/>
                 <w:color w:val="FFFFFF"/>
-                <w:sz w:val="15"/>
+                <w:sz w:val="16"/>
               </w:rPr>
               <w:t>95% Confidence Interval</w:t>
             </w:r>
@@ -831,7 +831,7 @@
       <w:tr>
         <w:tc>
           <w:tcPr>
-            <w:tcW w:type="dxa" w:w="1776"/>
+            <w:tcW w:type="dxa" w:w="1752"/>
             <w:tcMar>
               <w:top w:w="35" w:type="dxa"/>
               <w:bottom w:w="35" w:type="dxa"/>
@@ -845,7 +845,7 @@
             </w:pPr>
             <w:r>
               <w:rPr>
-                <w:sz w:val="15"/>
+                <w:sz w:val="16"/>
               </w:rPr>
               <w:t>Existing Credits: Full Dataset</w:t>
             </w:r>
@@ -853,7 +853,7 @@
         </w:tc>
         <w:tc>
           <w:tcPr>
-            <w:tcW w:type="dxa" w:w="1776"/>
+            <w:tcW w:type="dxa" w:w="1752"/>
             <w:tcMar>
               <w:top w:w="35" w:type="dxa"/>
               <w:bottom w:w="35" w:type="dxa"/>
@@ -867,7 +867,7 @@
             </w:pPr>
             <w:r>
               <w:rPr>
-                <w:sz w:val="15"/>
+                <w:sz w:val="16"/>
               </w:rPr>
               <w:t>1,000</w:t>
             </w:r>
@@ -875,7 +875,7 @@
         </w:tc>
         <w:tc>
           <w:tcPr>
-            <w:tcW w:type="dxa" w:w="1776"/>
+            <w:tcW w:type="dxa" w:w="1752"/>
             <w:tcMar>
               <w:top w:w="35" w:type="dxa"/>
               <w:bottom w:w="35" w:type="dxa"/>
@@ -889,7 +889,7 @@
             </w:pPr>
             <w:r>
               <w:rPr>
-                <w:sz w:val="15"/>
+                <w:sz w:val="16"/>
               </w:rPr>
               <w:t>+0.1780</w:t>
             </w:r>
@@ -897,7 +897,7 @@
         </w:tc>
         <w:tc>
           <w:tcPr>
-            <w:tcW w:type="dxa" w:w="1776"/>
+            <w:tcW w:type="dxa" w:w="1752"/>
             <w:tcMar>
               <w:top w:w="35" w:type="dxa"/>
               <w:bottom w:w="35" w:type="dxa"/>
@@ -911,7 +911,7 @@
             </w:pPr>
             <w:r>
               <w:rPr>
-                <w:sz w:val="15"/>
+                <w:sz w:val="16"/>
               </w:rPr>
               <w:t>0.1232</w:t>
             </w:r>
@@ -919,7 +919,7 @@
         </w:tc>
         <w:tc>
           <w:tcPr>
-            <w:tcW w:type="dxa" w:w="1776"/>
+            <w:tcW w:type="dxa" w:w="1752"/>
             <w:tcMar>
               <w:top w:w="35" w:type="dxa"/>
               <w:bottom w:w="35" w:type="dxa"/>
@@ -933,7 +933,7 @@
             </w:pPr>
             <w:r>
               <w:rPr>
-                <w:sz w:val="15"/>
+                <w:sz w:val="16"/>
               </w:rPr>
               <w:t>0.1488</w:t>
             </w:r>
@@ -941,7 +941,7 @@
         </w:tc>
         <w:tc>
           <w:tcPr>
-            <w:tcW w:type="dxa" w:w="1776"/>
+            <w:tcW w:type="dxa" w:w="1752"/>
             <w:tcMar>
               <w:top w:w="35" w:type="dxa"/>
               <w:bottom w:w="35" w:type="dxa"/>
@@ -955,7 +955,7 @@
             </w:pPr>
             <w:r>
               <w:rPr>
-                <w:sz w:val="15"/>
+                <w:sz w:val="16"/>
               </w:rPr>
               <w:t>[-0.0636, +0.4195] (Weak Positive)</w:t>
             </w:r>
@@ -965,7 +965,7 @@
       <w:tr>
         <w:tc>
           <w:tcPr>
-            <w:tcW w:type="dxa" w:w="1776"/>
+            <w:tcW w:type="dxa" w:w="1752"/>
             <w:shd w:fill="F8FAFC"/>
             <w:tcMar>
               <w:top w:w="35" w:type="dxa"/>
@@ -980,7 +980,7 @@
             </w:pPr>
             <w:r>
               <w:rPr>
-                <w:sz w:val="15"/>
+                <w:sz w:val="16"/>
               </w:rPr>
               <w:t>Existing Credits: Young (&lt;30)</w:t>
             </w:r>
@@ -988,7 +988,7 @@
         </w:tc>
         <w:tc>
           <w:tcPr>
-            <w:tcW w:type="dxa" w:w="1776"/>
+            <w:tcW w:type="dxa" w:w="1752"/>
             <w:shd w:fill="F8FAFC"/>
             <w:tcMar>
               <w:top w:w="35" w:type="dxa"/>
@@ -1003,7 +1003,7 @@
             </w:pPr>
             <w:r>
               <w:rPr>
-                <w:sz w:val="15"/>
+                <w:sz w:val="16"/>
               </w:rPr>
               <w:t>371</w:t>
             </w:r>
@@ -1011,7 +1011,7 @@
         </w:tc>
         <w:tc>
           <w:tcPr>
-            <w:tcW w:type="dxa" w:w="1776"/>
+            <w:tcW w:type="dxa" w:w="1752"/>
             <w:shd w:fill="F8FAFC"/>
             <w:tcMar>
               <w:top w:w="35" w:type="dxa"/>
@@ -1026,7 +1026,7 @@
             </w:pPr>
             <w:r>
               <w:rPr>
-                <w:sz w:val="15"/>
+                <w:sz w:val="16"/>
               </w:rPr>
               <w:t>-0.2203</w:t>
             </w:r>
@@ -1034,7 +1034,7 @@
         </w:tc>
         <w:tc>
           <w:tcPr>
-            <w:tcW w:type="dxa" w:w="1776"/>
+            <w:tcW w:type="dxa" w:w="1752"/>
             <w:shd w:fill="F8FAFC"/>
             <w:tcMar>
               <w:top w:w="35" w:type="dxa"/>
@@ -1049,7 +1049,7 @@
             </w:pPr>
             <w:r>
               <w:rPr>
-                <w:sz w:val="15"/>
+                <w:sz w:val="16"/>
               </w:rPr>
               <w:t>0.2133</w:t>
             </w:r>
@@ -1057,7 +1057,7 @@
         </w:tc>
         <w:tc>
           <w:tcPr>
-            <w:tcW w:type="dxa" w:w="1776"/>
+            <w:tcW w:type="dxa" w:w="1752"/>
             <w:shd w:fill="F8FAFC"/>
             <w:tcMar>
               <w:top w:w="35" w:type="dxa"/>
@@ -1072,7 +1072,7 @@
             </w:pPr>
             <w:r>
               <w:rPr>
-                <w:sz w:val="15"/>
+                <w:sz w:val="16"/>
               </w:rPr>
               <w:t>0.3016</w:t>
             </w:r>
@@ -1080,7 +1080,7 @@
         </w:tc>
         <w:tc>
           <w:tcPr>
-            <w:tcW w:type="dxa" w:w="1776"/>
+            <w:tcW w:type="dxa" w:w="1752"/>
             <w:shd w:fill="FEE2E2"/>
             <w:tcMar>
               <w:top w:w="35" w:type="dxa"/>
@@ -1096,7 +1096,7 @@
             <w:r>
               <w:rPr>
                 <w:b/>
-                <w:sz w:val="15"/>
+                <w:sz w:val="16"/>
               </w:rPr>
               <w:t>[-0.6384, +0.1977] (Sign Reversal)</w:t>
             </w:r>
@@ -1106,7 +1106,7 @@
       <w:tr>
         <w:tc>
           <w:tcPr>
-            <w:tcW w:type="dxa" w:w="1776"/>
+            <w:tcW w:type="dxa" w:w="1752"/>
             <w:tcMar>
               <w:top w:w="35" w:type="dxa"/>
               <w:bottom w:w="35" w:type="dxa"/>
@@ -1120,7 +1120,7 @@
             </w:pPr>
             <w:r>
               <w:rPr>
-                <w:sz w:val="15"/>
+                <w:sz w:val="16"/>
               </w:rPr>
               <w:t>Existing Credits: Mature (&gt;=30)</w:t>
             </w:r>
@@ -1128,7 +1128,7 @@
         </w:tc>
         <w:tc>
           <w:tcPr>
-            <w:tcW w:type="dxa" w:w="1776"/>
+            <w:tcW w:type="dxa" w:w="1752"/>
             <w:tcMar>
               <w:top w:w="35" w:type="dxa"/>
               <w:bottom w:w="35" w:type="dxa"/>
@@ -1142,7 +1142,7 @@
             </w:pPr>
             <w:r>
               <w:rPr>
-                <w:sz w:val="15"/>
+                <w:sz w:val="16"/>
               </w:rPr>
               <w:t>629</w:t>
             </w:r>
@@ -1150,7 +1150,7 @@
         </w:tc>
         <w:tc>
           <w:tcPr>
-            <w:tcW w:type="dxa" w:w="1776"/>
+            <w:tcW w:type="dxa" w:w="1752"/>
             <w:tcMar>
               <w:top w:w="35" w:type="dxa"/>
               <w:bottom w:w="35" w:type="dxa"/>
@@ -1164,7 +1164,7 @@
             </w:pPr>
             <w:r>
               <w:rPr>
-                <w:sz w:val="15"/>
+                <w:sz w:val="16"/>
               </w:rPr>
               <w:t>+0.3083</w:t>
             </w:r>
@@ -1172,7 +1172,7 @@
         </w:tc>
         <w:tc>
           <w:tcPr>
-            <w:tcW w:type="dxa" w:w="1776"/>
+            <w:tcW w:type="dxa" w:w="1752"/>
             <w:tcMar>
               <w:top w:w="35" w:type="dxa"/>
               <w:bottom w:w="35" w:type="dxa"/>
@@ -1186,7 +1186,7 @@
             </w:pPr>
             <w:r>
               <w:rPr>
-                <w:sz w:val="15"/>
+                <w:sz w:val="16"/>
               </w:rPr>
               <w:t>0.1586</w:t>
             </w:r>
@@ -1194,7 +1194,7 @@
         </w:tc>
         <w:tc>
           <w:tcPr>
-            <w:tcW w:type="dxa" w:w="1776"/>
+            <w:tcW w:type="dxa" w:w="1752"/>
             <w:tcMar>
               <w:top w:w="35" w:type="dxa"/>
               <w:bottom w:w="35" w:type="dxa"/>
@@ -1208,7 +1208,7 @@
             </w:pPr>
             <w:r>
               <w:rPr>
-                <w:sz w:val="15"/>
+                <w:sz w:val="16"/>
               </w:rPr>
               <w:t>0.0519</w:t>
             </w:r>
@@ -1216,7 +1216,7 @@
         </w:tc>
         <w:tc>
           <w:tcPr>
-            <w:tcW w:type="dxa" w:w="1776"/>
+            <w:tcW w:type="dxa" w:w="1752"/>
             <w:tcMar>
               <w:top w:w="35" w:type="dxa"/>
               <w:bottom w:w="35" w:type="dxa"/>
@@ -1230,7 +1230,7 @@
             </w:pPr>
             <w:r>
               <w:rPr>
-                <w:sz w:val="15"/>
+                <w:sz w:val="16"/>
               </w:rPr>
               <w:t>[-0.0025, +0.6192] (Positive Asset)</w:t>
             </w:r>
@@ -1240,7 +1240,7 @@
       <w:tr>
         <w:tc>
           <w:tcPr>
-            <w:tcW w:type="dxa" w:w="1776"/>
+            <w:tcW w:type="dxa" w:w="1752"/>
             <w:shd w:fill="F8FAFC"/>
             <w:tcMar>
               <w:top w:w="35" w:type="dxa"/>
@@ -1255,7 +1255,7 @@
             </w:pPr>
             <w:r>
               <w:rPr>
-                <w:sz w:val="15"/>
+                <w:sz w:val="16"/>
               </w:rPr>
               <w:t>Multivariable Age: Male Subgroup</w:t>
             </w:r>
@@ -1263,7 +1263,7 @@
         </w:tc>
         <w:tc>
           <w:tcPr>
-            <w:tcW w:type="dxa" w:w="1776"/>
+            <w:tcW w:type="dxa" w:w="1752"/>
             <w:shd w:fill="F8FAFC"/>
             <w:tcMar>
               <w:top w:w="35" w:type="dxa"/>
@@ -1278,7 +1278,7 @@
             </w:pPr>
             <w:r>
               <w:rPr>
-                <w:sz w:val="15"/>
+                <w:sz w:val="16"/>
               </w:rPr>
               <w:t>690</w:t>
             </w:r>
@@ -1286,7 +1286,7 @@
         </w:tc>
         <w:tc>
           <w:tcPr>
-            <w:tcW w:type="dxa" w:w="1776"/>
+            <w:tcW w:type="dxa" w:w="1752"/>
             <w:shd w:fill="F8FAFC"/>
             <w:tcMar>
               <w:top w:w="35" w:type="dxa"/>
@@ -1301,7 +1301,7 @@
             </w:pPr>
             <w:r>
               <w:rPr>
-                <w:sz w:val="15"/>
+                <w:sz w:val="16"/>
               </w:rPr>
               <w:t>+0.0604</w:t>
             </w:r>
@@ -1309,7 +1309,7 @@
         </w:tc>
         <w:tc>
           <w:tcPr>
-            <w:tcW w:type="dxa" w:w="1776"/>
+            <w:tcW w:type="dxa" w:w="1752"/>
             <w:shd w:fill="F8FAFC"/>
             <w:tcMar>
               <w:top w:w="35" w:type="dxa"/>
@@ -1324,7 +1324,7 @@
             </w:pPr>
             <w:r>
               <w:rPr>
-                <w:sz w:val="15"/>
+                <w:sz w:val="16"/>
               </w:rPr>
               <w:t>0.0940</w:t>
             </w:r>
@@ -1332,7 +1332,7 @@
         </w:tc>
         <w:tc>
           <w:tcPr>
-            <w:tcW w:type="dxa" w:w="1776"/>
+            <w:tcW w:type="dxa" w:w="1752"/>
             <w:shd w:fill="F8FAFC"/>
             <w:tcMar>
               <w:top w:w="35" w:type="dxa"/>
@@ -1347,7 +1347,7 @@
             </w:pPr>
             <w:r>
               <w:rPr>
-                <w:sz w:val="15"/>
+                <w:sz w:val="16"/>
               </w:rPr>
               <w:t>0.5204</w:t>
             </w:r>
@@ -1355,7 +1355,7 @@
         </w:tc>
         <w:tc>
           <w:tcPr>
-            <w:tcW w:type="dxa" w:w="1776"/>
+            <w:tcW w:type="dxa" w:w="1752"/>
             <w:shd w:fill="F8FAFC"/>
             <w:tcMar>
               <w:top w:w="35" w:type="dxa"/>
@@ -1370,7 +1370,7 @@
             </w:pPr>
             <w:r>
               <w:rPr>
-                <w:sz w:val="15"/>
+                <w:sz w:val="16"/>
               </w:rPr>
               <w:t>[-0.1238, +0.2445] (Null for Men)</w:t>
             </w:r>
@@ -1380,7 +1380,7 @@
       <w:tr>
         <w:tc>
           <w:tcPr>
-            <w:tcW w:type="dxa" w:w="1776"/>
+            <w:tcW w:type="dxa" w:w="1752"/>
             <w:tcMar>
               <w:top w:w="35" w:type="dxa"/>
               <w:bottom w:w="35" w:type="dxa"/>
@@ -1394,7 +1394,7 @@
             </w:pPr>
             <w:r>
               <w:rPr>
-                <w:sz w:val="15"/>
+                <w:sz w:val="16"/>
               </w:rPr>
               <w:t>Multivariable Age: Female Subgroup</w:t>
             </w:r>
@@ -1402,7 +1402,7 @@
         </w:tc>
         <w:tc>
           <w:tcPr>
-            <w:tcW w:type="dxa" w:w="1776"/>
+            <w:tcW w:type="dxa" w:w="1752"/>
             <w:tcMar>
               <w:top w:w="35" w:type="dxa"/>
               <w:bottom w:w="35" w:type="dxa"/>
@@ -1416,7 +1416,7 @@
             </w:pPr>
             <w:r>
               <w:rPr>
-                <w:sz w:val="15"/>
+                <w:sz w:val="16"/>
               </w:rPr>
               <w:t>310</w:t>
             </w:r>
@@ -1424,7 +1424,7 @@
         </w:tc>
         <w:tc>
           <w:tcPr>
-            <w:tcW w:type="dxa" w:w="1776"/>
+            <w:tcW w:type="dxa" w:w="1752"/>
             <w:tcMar>
               <w:top w:w="35" w:type="dxa"/>
               <w:bottom w:w="35" w:type="dxa"/>
@@ -1438,7 +1438,7 @@
             </w:pPr>
             <w:r>
               <w:rPr>
-                <w:sz w:val="15"/>
+                <w:sz w:val="16"/>
               </w:rPr>
               <w:t>+0.4741</w:t>
             </w:r>
@@ -1446,7 +1446,7 @@
         </w:tc>
         <w:tc>
           <w:tcPr>
-            <w:tcW w:type="dxa" w:w="1776"/>
+            <w:tcW w:type="dxa" w:w="1752"/>
             <w:tcMar>
               <w:top w:w="35" w:type="dxa"/>
               <w:bottom w:w="35" w:type="dxa"/>
@@ -1460,7 +1460,7 @@
             </w:pPr>
             <w:r>
               <w:rPr>
-                <w:sz w:val="15"/>
+                <w:sz w:val="16"/>
               </w:rPr>
               <w:t>0.1469</w:t>
             </w:r>
@@ -1468,7 +1468,7 @@
         </w:tc>
         <w:tc>
           <w:tcPr>
-            <w:tcW w:type="dxa" w:w="1776"/>
+            <w:tcW w:type="dxa" w:w="1752"/>
             <w:tcMar>
               <w:top w:w="35" w:type="dxa"/>
               <w:bottom w:w="35" w:type="dxa"/>
@@ -1482,7 +1482,7 @@
             </w:pPr>
             <w:r>
               <w:rPr>
-                <w:sz w:val="15"/>
+                <w:sz w:val="16"/>
               </w:rPr>
               <w:t>0.0013</w:t>
             </w:r>
@@ -1490,7 +1490,7 @@
         </w:tc>
         <w:tc>
           <w:tcPr>
-            <w:tcW w:type="dxa" w:w="1776"/>
+            <w:tcW w:type="dxa" w:w="1752"/>
             <w:shd w:fill="DCFCE7"/>
             <w:tcMar>
               <w:top w:w="35" w:type="dxa"/>
@@ -1506,7 +1506,7 @@
             <w:r>
               <w:rPr>
                 <w:b/>
-                <w:sz w:val="15"/>
+                <w:sz w:val="16"/>
               </w:rPr>
               <w:t>[+0.1861, +0.7620] (~8x Effect Size)</w:t>
             </w:r>
@@ -1522,7 +1522,7 @@
       <w:r>
         <w:drawing>
           <wp:inline xmlns:a="http://schemas.openxmlformats.org/drawingml/2006/main" xmlns:pic="http://schemas.openxmlformats.org/drawingml/2006/picture">
-            <wp:extent cx="4389120" cy="1567543"/>
+            <wp:extent cx="4206240" cy="1502229"/>
             <wp:docPr id="2" name="Picture 2"/>
             <wp:cNvGraphicFramePr>
               <a:graphicFrameLocks noChangeAspect="1"/>
@@ -1543,7 +1543,7 @@
                   <pic:spPr>
                     <a:xfrm>
                       <a:off x="0" y="0"/>
-                      <a:ext cx="4389120" cy="1567543"/>
+                      <a:ext cx="4206240" cy="1502229"/>
                     </a:xfrm>
                     <a:prstGeom prst="rect"/>
                   </pic:spPr>
@@ -1557,13 +1557,13 @@
     <w:p>
       <w:pPr>
         <w:keepNext/>
-        <w:spacing w:before="120" w:after="40"/>
+        <w:spacing w:before="140" w:after="40"/>
       </w:pPr>
       <w:r>
         <w:rPr>
           <w:b/>
           <w:color w:val="1E3A8A"/>
-          <w:sz w:val="21"/>
+          <w:sz w:val="22"/>
         </w:rPr>
         <w:t>Part 2.2 — Omitted-Variable Bias (OVB) Stress-Testing</w:t>
       </w:r>
@@ -1580,17 +1580,17 @@
         <w:tblLook w:firstColumn="1" w:firstRow="1" w:lastColumn="0" w:lastRow="0" w:noHBand="0" w:noVBand="1" w:val="04A0"/>
       </w:tblPr>
       <w:tblGrid>
-        <w:gridCol w:w="1776"/>
-        <w:gridCol w:w="1776"/>
-        <w:gridCol w:w="1776"/>
-        <w:gridCol w:w="1776"/>
-        <w:gridCol w:w="1776"/>
-        <w:gridCol w:w="1776"/>
+        <w:gridCol w:w="1752"/>
+        <w:gridCol w:w="1752"/>
+        <w:gridCol w:w="1752"/>
+        <w:gridCol w:w="1752"/>
+        <w:gridCol w:w="1752"/>
+        <w:gridCol w:w="1752"/>
       </w:tblGrid>
       <w:tr>
         <w:tc>
           <w:tcPr>
-            <w:tcW w:type="dxa" w:w="1776"/>
+            <w:tcW w:type="dxa" w:w="1752"/>
             <w:shd w:fill="1E3A8A"/>
             <w:tcMar>
               <w:top w:w="40" w:type="dxa"/>
@@ -1607,7 +1607,7 @@
               <w:rPr>
                 <w:b/>
                 <w:color w:val="FFFFFF"/>
-                <w:sz w:val="15"/>
+                <w:sz w:val="16"/>
               </w:rPr>
               <w:t>Predictor Variable</w:t>
             </w:r>
@@ -1615,7 +1615,7 @@
         </w:tc>
         <w:tc>
           <w:tcPr>
-            <w:tcW w:type="dxa" w:w="1776"/>
+            <w:tcW w:type="dxa" w:w="1752"/>
             <w:shd w:fill="1E3A8A"/>
             <w:tcMar>
               <w:top w:w="40" w:type="dxa"/>
@@ -1632,7 +1632,7 @@
               <w:rPr>
                 <w:b/>
                 <w:color w:val="FFFFFF"/>
-                <w:sz w:val="15"/>
+                <w:sz w:val="16"/>
               </w:rPr>
               <w:t>Role / Meaning</w:t>
             </w:r>
@@ -1640,7 +1640,7 @@
         </w:tc>
         <w:tc>
           <w:tcPr>
-            <w:tcW w:type="dxa" w:w="1776"/>
+            <w:tcW w:type="dxa" w:w="1752"/>
             <w:shd w:fill="1E3A8A"/>
             <w:tcMar>
               <w:top w:w="40" w:type="dxa"/>
@@ -1657,7 +1657,7 @@
               <w:rPr>
                 <w:b/>
                 <w:color w:val="FFFFFF"/>
-                <w:sz w:val="15"/>
+                <w:sz w:val="16"/>
               </w:rPr>
               <w:t>Full beta</w:t>
             </w:r>
@@ -1665,7 +1665,7 @@
         </w:tc>
         <w:tc>
           <w:tcPr>
-            <w:tcW w:type="dxa" w:w="1776"/>
+            <w:tcW w:type="dxa" w:w="1752"/>
             <w:shd w:fill="1E3A8A"/>
             <w:tcMar>
               <w:top w:w="40" w:type="dxa"/>
@@ -1682,7 +1682,7 @@
               <w:rPr>
                 <w:b/>
                 <w:color w:val="FFFFFF"/>
-                <w:sz w:val="15"/>
+                <w:sz w:val="16"/>
               </w:rPr>
               <w:t>Reduced beta</w:t>
             </w:r>
@@ -1690,7 +1690,7 @@
         </w:tc>
         <w:tc>
           <w:tcPr>
-            <w:tcW w:type="dxa" w:w="1776"/>
+            <w:tcW w:type="dxa" w:w="1752"/>
             <w:shd w:fill="1E3A8A"/>
             <w:tcMar>
               <w:top w:w="40" w:type="dxa"/>
@@ -1707,7 +1707,7 @@
               <w:rPr>
                 <w:b/>
                 <w:color w:val="FFFFFF"/>
-                <w:sz w:val="15"/>
+                <w:sz w:val="16"/>
               </w:rPr>
               <w:t>Shift Delta beta</w:t>
             </w:r>
@@ -1715,7 +1715,7 @@
         </w:tc>
         <w:tc>
           <w:tcPr>
-            <w:tcW w:type="dxa" w:w="1776"/>
+            <w:tcW w:type="dxa" w:w="1752"/>
             <w:shd w:fill="1E3A8A"/>
             <w:tcMar>
               <w:top w:w="40" w:type="dxa"/>
@@ -1732,7 +1732,7 @@
               <w:rPr>
                 <w:b/>
                 <w:color w:val="FFFFFF"/>
-                <w:sz w:val="15"/>
+                <w:sz w:val="16"/>
               </w:rPr>
               <w:t>% Change</w:t>
             </w:r>
@@ -1742,7 +1742,7 @@
       <w:tr>
         <w:tc>
           <w:tcPr>
-            <w:tcW w:type="dxa" w:w="1776"/>
+            <w:tcW w:type="dxa" w:w="1752"/>
             <w:tcMar>
               <w:top w:w="35" w:type="dxa"/>
               <w:bottom w:w="35" w:type="dxa"/>
@@ -1756,7 +1756,7 @@
             </w:pPr>
             <w:r>
               <w:rPr>
-                <w:sz w:val="15"/>
+                <w:sz w:val="16"/>
               </w:rPr>
               <w:t>savings_status_A63</w:t>
             </w:r>
@@ -1764,7 +1764,7 @@
         </w:tc>
         <w:tc>
           <w:tcPr>
-            <w:tcW w:type="dxa" w:w="1776"/>
+            <w:tcW w:type="dxa" w:w="1752"/>
             <w:tcMar>
               <w:top w:w="35" w:type="dxa"/>
               <w:bottom w:w="35" w:type="dxa"/>
@@ -1778,7 +1778,7 @@
             </w:pPr>
             <w:r>
               <w:rPr>
-                <w:sz w:val="15"/>
+                <w:sz w:val="16"/>
               </w:rPr>
               <w:t>Savings 500–1000 DM</w:t>
             </w:r>
@@ -1786,7 +1786,7 @@
         </w:tc>
         <w:tc>
           <w:tcPr>
-            <w:tcW w:type="dxa" w:w="1776"/>
+            <w:tcW w:type="dxa" w:w="1752"/>
             <w:tcMar>
               <w:top w:w="35" w:type="dxa"/>
               <w:bottom w:w="35" w:type="dxa"/>
@@ -1800,7 +1800,7 @@
             </w:pPr>
             <w:r>
               <w:rPr>
-                <w:sz w:val="15"/>
+                <w:sz w:val="16"/>
               </w:rPr>
               <w:t>+0.3720</w:t>
             </w:r>
@@ -1808,7 +1808,7 @@
         </w:tc>
         <w:tc>
           <w:tcPr>
-            <w:tcW w:type="dxa" w:w="1776"/>
+            <w:tcW w:type="dxa" w:w="1752"/>
             <w:tcMar>
               <w:top w:w="35" w:type="dxa"/>
               <w:bottom w:w="35" w:type="dxa"/>
@@ -1822,7 +1822,7 @@
             </w:pPr>
             <w:r>
               <w:rPr>
-                <w:sz w:val="15"/>
+                <w:sz w:val="16"/>
               </w:rPr>
               <w:t>+0.7812</w:t>
             </w:r>
@@ -1830,7 +1830,7 @@
         </w:tc>
         <w:tc>
           <w:tcPr>
-            <w:tcW w:type="dxa" w:w="1776"/>
+            <w:tcW w:type="dxa" w:w="1752"/>
             <w:tcMar>
               <w:top w:w="35" w:type="dxa"/>
               <w:bottom w:w="35" w:type="dxa"/>
@@ -1844,7 +1844,7 @@
             </w:pPr>
             <w:r>
               <w:rPr>
-                <w:sz w:val="15"/>
+                <w:sz w:val="16"/>
               </w:rPr>
               <w:t>+0.4092</w:t>
             </w:r>
@@ -1852,7 +1852,7 @@
         </w:tc>
         <w:tc>
           <w:tcPr>
-            <w:tcW w:type="dxa" w:w="1776"/>
+            <w:tcW w:type="dxa" w:w="1752"/>
             <w:shd w:fill="DBEAFE"/>
             <w:tcMar>
               <w:top w:w="35" w:type="dxa"/>
@@ -1868,7 +1868,7 @@
             <w:r>
               <w:rPr>
                 <w:b/>
-                <w:sz w:val="15"/>
+                <w:sz w:val="16"/>
               </w:rPr>
               <w:t>+110.00% (Surge)</w:t>
             </w:r>
@@ -1878,7 +1878,7 @@
       <w:tr>
         <w:tc>
           <w:tcPr>
-            <w:tcW w:type="dxa" w:w="1776"/>
+            <w:tcW w:type="dxa" w:w="1752"/>
             <w:shd w:fill="F8FAFC"/>
             <w:tcMar>
               <w:top w:w="35" w:type="dxa"/>
@@ -1893,7 +1893,7 @@
             </w:pPr>
             <w:r>
               <w:rPr>
-                <w:sz w:val="15"/>
+                <w:sz w:val="16"/>
               </w:rPr>
               <w:t>employment_A73</w:t>
             </w:r>
@@ -1901,7 +1901,7 @@
         </w:tc>
         <w:tc>
           <w:tcPr>
-            <w:tcW w:type="dxa" w:w="1776"/>
+            <w:tcW w:type="dxa" w:w="1752"/>
             <w:shd w:fill="F8FAFC"/>
             <w:tcMar>
               <w:top w:w="35" w:type="dxa"/>
@@ -1916,7 +1916,7 @@
             </w:pPr>
             <w:r>
               <w:rPr>
-                <w:sz w:val="15"/>
+                <w:sz w:val="16"/>
               </w:rPr>
               <w:t>Job Tenure 1–4 Yrs</w:t>
             </w:r>
@@ -1924,7 +1924,7 @@
         </w:tc>
         <w:tc>
           <w:tcPr>
-            <w:tcW w:type="dxa" w:w="1776"/>
+            <w:tcW w:type="dxa" w:w="1752"/>
             <w:shd w:fill="F8FAFC"/>
             <w:tcMar>
               <w:top w:w="35" w:type="dxa"/>
@@ -1939,7 +1939,7 @@
             </w:pPr>
             <w:r>
               <w:rPr>
-                <w:sz w:val="15"/>
+                <w:sz w:val="16"/>
               </w:rPr>
               <w:t>+0.1278</w:t>
             </w:r>
@@ -1947,7 +1947,7 @@
         </w:tc>
         <w:tc>
           <w:tcPr>
-            <w:tcW w:type="dxa" w:w="1776"/>
+            <w:tcW w:type="dxa" w:w="1752"/>
             <w:shd w:fill="F8FAFC"/>
             <w:tcMar>
               <w:top w:w="35" w:type="dxa"/>
@@ -1962,7 +1962,7 @@
             </w:pPr>
             <w:r>
               <w:rPr>
-                <w:sz w:val="15"/>
+                <w:sz w:val="16"/>
               </w:rPr>
               <w:t>+0.2560</w:t>
             </w:r>
@@ -1970,7 +1970,7 @@
         </w:tc>
         <w:tc>
           <w:tcPr>
-            <w:tcW w:type="dxa" w:w="1776"/>
+            <w:tcW w:type="dxa" w:w="1752"/>
             <w:shd w:fill="F8FAFC"/>
             <w:tcMar>
               <w:top w:w="35" w:type="dxa"/>
@@ -1985,7 +1985,7 @@
             </w:pPr>
             <w:r>
               <w:rPr>
-                <w:sz w:val="15"/>
+                <w:sz w:val="16"/>
               </w:rPr>
               <w:t>+0.1282</w:t>
             </w:r>
@@ -1993,7 +1993,7 @@
         </w:tc>
         <w:tc>
           <w:tcPr>
-            <w:tcW w:type="dxa" w:w="1776"/>
+            <w:tcW w:type="dxa" w:w="1752"/>
             <w:shd w:fill="DBEAFE"/>
             <w:tcMar>
               <w:top w:w="35" w:type="dxa"/>
@@ -2009,7 +2009,7 @@
             <w:r>
               <w:rPr>
                 <w:b/>
-                <w:sz w:val="15"/>
+                <w:sz w:val="16"/>
               </w:rPr>
               <w:t>+100.31% (Surge)</w:t>
             </w:r>
@@ -2019,7 +2019,7 @@
       <w:tr>
         <w:tc>
           <w:tcPr>
-            <w:tcW w:type="dxa" w:w="1776"/>
+            <w:tcW w:type="dxa" w:w="1752"/>
             <w:tcMar>
               <w:top w:w="35" w:type="dxa"/>
               <w:bottom w:w="35" w:type="dxa"/>
@@ -2033,7 +2033,7 @@
             </w:pPr>
             <w:r>
               <w:rPr>
-                <w:sz w:val="15"/>
+                <w:sz w:val="16"/>
               </w:rPr>
               <w:t>credit_history_A33</w:t>
             </w:r>
@@ -2041,7 +2041,7 @@
         </w:tc>
         <w:tc>
           <w:tcPr>
-            <w:tcW w:type="dxa" w:w="1776"/>
+            <w:tcW w:type="dxa" w:w="1752"/>
             <w:tcMar>
               <w:top w:w="35" w:type="dxa"/>
               <w:bottom w:w="35" w:type="dxa"/>
@@ -2055,7 +2055,7 @@
             </w:pPr>
             <w:r>
               <w:rPr>
-                <w:sz w:val="15"/>
+                <w:sz w:val="16"/>
               </w:rPr>
               <w:t>Past Payment Delay</w:t>
             </w:r>
@@ -2063,7 +2063,7 @@
         </w:tc>
         <w:tc>
           <w:tcPr>
-            <w:tcW w:type="dxa" w:w="1776"/>
+            <w:tcW w:type="dxa" w:w="1752"/>
             <w:tcMar>
               <w:top w:w="35" w:type="dxa"/>
               <w:bottom w:w="35" w:type="dxa"/>
@@ -2077,7 +2077,7 @@
             </w:pPr>
             <w:r>
               <w:rPr>
-                <w:sz w:val="15"/>
+                <w:sz w:val="16"/>
               </w:rPr>
               <w:t>+0.3941</w:t>
             </w:r>
@@ -2085,7 +2085,7 @@
         </w:tc>
         <w:tc>
           <w:tcPr>
-            <w:tcW w:type="dxa" w:w="1776"/>
+            <w:tcW w:type="dxa" w:w="1752"/>
             <w:tcMar>
               <w:top w:w="35" w:type="dxa"/>
               <w:bottom w:w="35" w:type="dxa"/>
@@ -2099,7 +2099,7 @@
             </w:pPr>
             <w:r>
               <w:rPr>
-                <w:sz w:val="15"/>
+                <w:sz w:val="16"/>
               </w:rPr>
               <w:t>+0.5956</w:t>
             </w:r>
@@ -2107,7 +2107,7 @@
         </w:tc>
         <w:tc>
           <w:tcPr>
-            <w:tcW w:type="dxa" w:w="1776"/>
+            <w:tcW w:type="dxa" w:w="1752"/>
             <w:tcMar>
               <w:top w:w="35" w:type="dxa"/>
               <w:bottom w:w="35" w:type="dxa"/>
@@ -2121,7 +2121,7 @@
             </w:pPr>
             <w:r>
               <w:rPr>
-                <w:sz w:val="15"/>
+                <w:sz w:val="16"/>
               </w:rPr>
               <w:t>+0.2015</w:t>
             </w:r>
@@ -2129,7 +2129,7 @@
         </w:tc>
         <w:tc>
           <w:tcPr>
-            <w:tcW w:type="dxa" w:w="1776"/>
+            <w:tcW w:type="dxa" w:w="1752"/>
             <w:tcMar>
               <w:top w:w="35" w:type="dxa"/>
               <w:bottom w:w="35" w:type="dxa"/>
@@ -2143,7 +2143,7 @@
             </w:pPr>
             <w:r>
               <w:rPr>
-                <w:sz w:val="15"/>
+                <w:sz w:val="16"/>
               </w:rPr>
               <w:t>+51.14%</w:t>
             </w:r>
@@ -2153,7 +2153,7 @@
       <w:tr>
         <w:tc>
           <w:tcPr>
-            <w:tcW w:type="dxa" w:w="1776"/>
+            <w:tcW w:type="dxa" w:w="1752"/>
             <w:shd w:fill="F8FAFC"/>
             <w:tcMar>
               <w:top w:w="35" w:type="dxa"/>
@@ -2168,7 +2168,7 @@
             </w:pPr>
             <w:r>
               <w:rPr>
-                <w:sz w:val="15"/>
+                <w:sz w:val="16"/>
               </w:rPr>
               <w:t>existing_credits</w:t>
             </w:r>
@@ -2176,7 +2176,7 @@
         </w:tc>
         <w:tc>
           <w:tcPr>
-            <w:tcW w:type="dxa" w:w="1776"/>
+            <w:tcW w:type="dxa" w:w="1752"/>
             <w:shd w:fill="F8FAFC"/>
             <w:tcMar>
               <w:top w:w="35" w:type="dxa"/>
@@ -2191,7 +2191,7 @@
             </w:pPr>
             <w:r>
               <w:rPr>
-                <w:sz w:val="15"/>
+                <w:sz w:val="16"/>
               </w:rPr>
               <w:t>Existing Bank Credits</w:t>
             </w:r>
@@ -2199,7 +2199,7 @@
         </w:tc>
         <w:tc>
           <w:tcPr>
-            <w:tcW w:type="dxa" w:w="1776"/>
+            <w:tcW w:type="dxa" w:w="1752"/>
             <w:shd w:fill="F8FAFC"/>
             <w:tcMar>
               <w:top w:w="35" w:type="dxa"/>
@@ -2214,7 +2214,7 @@
             </w:pPr>
             <w:r>
               <w:rPr>
-                <w:sz w:val="15"/>
+                <w:sz w:val="16"/>
               </w:rPr>
               <w:t>-0.0983</w:t>
             </w:r>
@@ -2222,7 +2222,7 @@
         </w:tc>
         <w:tc>
           <w:tcPr>
-            <w:tcW w:type="dxa" w:w="1776"/>
+            <w:tcW w:type="dxa" w:w="1752"/>
             <w:shd w:fill="F8FAFC"/>
             <w:tcMar>
               <w:top w:w="35" w:type="dxa"/>
@@ -2237,7 +2237,7 @@
             </w:pPr>
             <w:r>
               <w:rPr>
-                <w:sz w:val="15"/>
+                <w:sz w:val="16"/>
               </w:rPr>
               <w:t>-0.0656</w:t>
             </w:r>
@@ -2245,7 +2245,7 @@
         </w:tc>
         <w:tc>
           <w:tcPr>
-            <w:tcW w:type="dxa" w:w="1776"/>
+            <w:tcW w:type="dxa" w:w="1752"/>
             <w:shd w:fill="F8FAFC"/>
             <w:tcMar>
               <w:top w:w="35" w:type="dxa"/>
@@ -2260,7 +2260,7 @@
             </w:pPr>
             <w:r>
               <w:rPr>
-                <w:sz w:val="15"/>
+                <w:sz w:val="16"/>
               </w:rPr>
               <w:t>+0.0328</w:t>
             </w:r>
@@ -2268,7 +2268,7 @@
         </w:tc>
         <w:tc>
           <w:tcPr>
-            <w:tcW w:type="dxa" w:w="1776"/>
+            <w:tcW w:type="dxa" w:w="1752"/>
             <w:shd w:fill="F8FAFC"/>
             <w:tcMar>
               <w:top w:w="35" w:type="dxa"/>
@@ -2283,7 +2283,7 @@
             </w:pPr>
             <w:r>
               <w:rPr>
-                <w:sz w:val="15"/>
+                <w:sz w:val="16"/>
               </w:rPr>
               <w:t>+33.31%</w:t>
             </w:r>
@@ -2293,7 +2293,7 @@
       <w:tr>
         <w:tc>
           <w:tcPr>
-            <w:tcW w:type="dxa" w:w="1776"/>
+            <w:tcW w:type="dxa" w:w="1752"/>
             <w:tcMar>
               <w:top w:w="35" w:type="dxa"/>
               <w:bottom w:w="35" w:type="dxa"/>
@@ -2307,7 +2307,7 @@
             </w:pPr>
             <w:r>
               <w:rPr>
-                <w:sz w:val="15"/>
+                <w:sz w:val="16"/>
               </w:rPr>
               <w:t>age</w:t>
             </w:r>
@@ -2315,7 +2315,7 @@
         </w:tc>
         <w:tc>
           <w:tcPr>
-            <w:tcW w:type="dxa" w:w="1776"/>
+            <w:tcW w:type="dxa" w:w="1752"/>
             <w:tcMar>
               <w:top w:w="35" w:type="dxa"/>
               <w:bottom w:w="35" w:type="dxa"/>
@@ -2329,7 +2329,7 @@
             </w:pPr>
             <w:r>
               <w:rPr>
-                <w:sz w:val="15"/>
+                <w:sz w:val="16"/>
               </w:rPr>
               <w:t>Applicant Age</w:t>
             </w:r>
@@ -2337,7 +2337,7 @@
         </w:tc>
         <w:tc>
           <w:tcPr>
-            <w:tcW w:type="dxa" w:w="1776"/>
+            <w:tcW w:type="dxa" w:w="1752"/>
             <w:tcMar>
               <w:top w:w="35" w:type="dxa"/>
               <w:bottom w:w="35" w:type="dxa"/>
@@ -2351,7 +2351,7 @@
             </w:pPr>
             <w:r>
               <w:rPr>
-                <w:sz w:val="15"/>
+                <w:sz w:val="16"/>
               </w:rPr>
               <w:t>+0.1543</w:t>
             </w:r>
@@ -2359,7 +2359,7 @@
         </w:tc>
         <w:tc>
           <w:tcPr>
-            <w:tcW w:type="dxa" w:w="1776"/>
+            <w:tcW w:type="dxa" w:w="1752"/>
             <w:tcMar>
               <w:top w:w="35" w:type="dxa"/>
               <w:bottom w:w="35" w:type="dxa"/>
@@ -2373,7 +2373,7 @@
             </w:pPr>
             <w:r>
               <w:rPr>
-                <w:sz w:val="15"/>
+                <w:sz w:val="16"/>
               </w:rPr>
               <w:t>+0.1869</w:t>
             </w:r>
@@ -2381,7 +2381,7 @@
         </w:tc>
         <w:tc>
           <w:tcPr>
-            <w:tcW w:type="dxa" w:w="1776"/>
+            <w:tcW w:type="dxa" w:w="1752"/>
             <w:tcMar>
               <w:top w:w="35" w:type="dxa"/>
               <w:bottom w:w="35" w:type="dxa"/>
@@ -2395,7 +2395,7 @@
             </w:pPr>
             <w:r>
               <w:rPr>
-                <w:sz w:val="15"/>
+                <w:sz w:val="16"/>
               </w:rPr>
               <w:t>+0.0326</w:t>
             </w:r>
@@ -2403,7 +2403,7 @@
         </w:tc>
         <w:tc>
           <w:tcPr>
-            <w:tcW w:type="dxa" w:w="1776"/>
+            <w:tcW w:type="dxa" w:w="1752"/>
             <w:tcMar>
               <w:top w:w="35" w:type="dxa"/>
               <w:bottom w:w="35" w:type="dxa"/>
@@ -2417,7 +2417,7 @@
             </w:pPr>
             <w:r>
               <w:rPr>
-                <w:sz w:val="15"/>
+                <w:sz w:val="16"/>
               </w:rPr>
               <w:t>+21.16%</w:t>
             </w:r>
@@ -2427,7 +2427,7 @@
       <w:tr>
         <w:tc>
           <w:tcPr>
-            <w:tcW w:type="dxa" w:w="1776"/>
+            <w:tcW w:type="dxa" w:w="1752"/>
             <w:shd w:fill="F8FAFC"/>
             <w:tcMar>
               <w:top w:w="35" w:type="dxa"/>
@@ -2442,7 +2442,7 @@
             </w:pPr>
             <w:r>
               <w:rPr>
-                <w:sz w:val="15"/>
+                <w:sz w:val="16"/>
               </w:rPr>
               <w:t>duration</w:t>
             </w:r>
@@ -2450,7 +2450,7 @@
         </w:tc>
         <w:tc>
           <w:tcPr>
-            <w:tcW w:type="dxa" w:w="1776"/>
+            <w:tcW w:type="dxa" w:w="1752"/>
             <w:shd w:fill="F8FAFC"/>
             <w:tcMar>
               <w:top w:w="35" w:type="dxa"/>
@@ -2465,7 +2465,7 @@
             </w:pPr>
             <w:r>
               <w:rPr>
-                <w:sz w:val="15"/>
+                <w:sz w:val="16"/>
               </w:rPr>
               <w:t>Loan Duration (Mo.)</w:t>
             </w:r>
@@ -2473,7 +2473,7 @@
         </w:tc>
         <w:tc>
           <w:tcPr>
-            <w:tcW w:type="dxa" w:w="1776"/>
+            <w:tcW w:type="dxa" w:w="1752"/>
             <w:shd w:fill="F8FAFC"/>
             <w:tcMar>
               <w:top w:w="35" w:type="dxa"/>
@@ -2488,7 +2488,7 @@
             </w:pPr>
             <w:r>
               <w:rPr>
-                <w:sz w:val="15"/>
+                <w:sz w:val="16"/>
               </w:rPr>
               <w:t>-0.4273</w:t>
             </w:r>
@@ -2496,7 +2496,7 @@
         </w:tc>
         <w:tc>
           <w:tcPr>
-            <w:tcW w:type="dxa" w:w="1776"/>
+            <w:tcW w:type="dxa" w:w="1752"/>
             <w:shd w:fill="F8FAFC"/>
             <w:tcMar>
               <w:top w:w="35" w:type="dxa"/>
@@ -2511,7 +2511,7 @@
             </w:pPr>
             <w:r>
               <w:rPr>
-                <w:sz w:val="15"/>
+                <w:sz w:val="16"/>
               </w:rPr>
               <w:t>-0.4325</w:t>
             </w:r>
@@ -2519,7 +2519,7 @@
         </w:tc>
         <w:tc>
           <w:tcPr>
-            <w:tcW w:type="dxa" w:w="1776"/>
+            <w:tcW w:type="dxa" w:w="1752"/>
             <w:shd w:fill="F8FAFC"/>
             <w:tcMar>
               <w:top w:w="35" w:type="dxa"/>
@@ -2534,7 +2534,7 @@
             </w:pPr>
             <w:r>
               <w:rPr>
-                <w:sz w:val="15"/>
+                <w:sz w:val="16"/>
               </w:rPr>
               <w:t>-0.0052</w:t>
             </w:r>
@@ -2542,7 +2542,7 @@
         </w:tc>
         <w:tc>
           <w:tcPr>
-            <w:tcW w:type="dxa" w:w="1776"/>
+            <w:tcW w:type="dxa" w:w="1752"/>
             <w:shd w:fill="F8FAFC"/>
             <w:tcMar>
               <w:top w:w="35" w:type="dxa"/>
@@ -2557,7 +2557,7 @@
             </w:pPr>
             <w:r>
               <w:rPr>
-                <w:sz w:val="15"/>
+                <w:sz w:val="16"/>
               </w:rPr>
               <w:t>-1.21%</w:t>
             </w:r>
@@ -2573,7 +2573,7 @@
       <w:r>
         <w:drawing>
           <wp:inline xmlns:a="http://schemas.openxmlformats.org/drawingml/2006/main" xmlns:pic="http://schemas.openxmlformats.org/drawingml/2006/picture">
-            <wp:extent cx="4114800" cy="2057400"/>
+            <wp:extent cx="4023360" cy="2011680"/>
             <wp:docPr id="3" name="Picture 3"/>
             <wp:cNvGraphicFramePr>
               <a:graphicFrameLocks noChangeAspect="1"/>
@@ -2594,7 +2594,7 @@
                   <pic:spPr>
                     <a:xfrm>
                       <a:off x="0" y="0"/>
-                      <a:ext cx="4114800" cy="2057400"/>
+                      <a:ext cx="4023360" cy="2011680"/>
                     </a:xfrm>
                     <a:prstGeom prst="rect"/>
                   </pic:spPr>
@@ -2613,13 +2613,13 @@
     <w:p>
       <w:pPr>
         <w:keepNext/>
-        <w:spacing w:before="120" w:after="40"/>
+        <w:spacing w:before="140" w:after="40"/>
       </w:pPr>
       <w:r>
         <w:rPr>
           <w:b/>
           <w:color w:val="1E3A8A"/>
-          <w:sz w:val="21"/>
+          <w:sz w:val="22"/>
         </w:rPr>
         <w:t>Part 2.3 — Adversarial Subset Construction &amp; Failure Mechanics</w:t>
       </w:r>
@@ -2636,15 +2636,15 @@
         <w:tblLook w:firstColumn="1" w:firstRow="1" w:lastColumn="0" w:lastRow="0" w:noHBand="0" w:noVBand="1" w:val="04A0"/>
       </w:tblPr>
       <w:tblGrid>
-        <w:gridCol w:w="2664"/>
-        <w:gridCol w:w="2664"/>
-        <w:gridCol w:w="2664"/>
-        <w:gridCol w:w="2664"/>
+        <w:gridCol w:w="2628"/>
+        <w:gridCol w:w="2628"/>
+        <w:gridCol w:w="2628"/>
+        <w:gridCol w:w="2628"/>
       </w:tblGrid>
       <w:tr>
         <w:tc>
           <w:tcPr>
-            <w:tcW w:type="dxa" w:w="2664"/>
+            <w:tcW w:type="dxa" w:w="2628"/>
             <w:shd w:fill="1E3A8A"/>
             <w:tcMar>
               <w:top w:w="40" w:type="dxa"/>
@@ -2661,7 +2661,7 @@
               <w:rPr>
                 <w:b/>
                 <w:color w:val="FFFFFF"/>
-                <w:sz w:val="15"/>
+                <w:sz w:val="16"/>
               </w:rPr>
               <w:t>Attribute / Demographic Metric</w:t>
             </w:r>
@@ -2669,7 +2669,7 @@
         </w:tc>
         <w:tc>
           <w:tcPr>
-            <w:tcW w:type="dxa" w:w="2664"/>
+            <w:tcW w:type="dxa" w:w="2628"/>
             <w:shd w:fill="1E3A8A"/>
             <w:tcMar>
               <w:top w:w="40" w:type="dxa"/>
@@ -2686,7 +2686,7 @@
               <w:rPr>
                 <w:b/>
                 <w:color w:val="FFFFFF"/>
-                <w:sz w:val="15"/>
+                <w:sz w:val="16"/>
               </w:rPr>
               <w:t>Test Set Baseline (N=300)</w:t>
             </w:r>
@@ -2694,7 +2694,7 @@
         </w:tc>
         <w:tc>
           <w:tcPr>
-            <w:tcW w:type="dxa" w:w="2664"/>
+            <w:tcW w:type="dxa" w:w="2628"/>
             <w:shd w:fill="1E3A8A"/>
             <w:tcMar>
               <w:top w:w="40" w:type="dxa"/>
@@ -2711,7 +2711,7 @@
               <w:rPr>
                 <w:b/>
                 <w:color w:val="FFFFFF"/>
-                <w:sz w:val="15"/>
+                <w:sz w:val="16"/>
               </w:rPr>
               <w:t>Adversarial Subset (N=24)</w:t>
             </w:r>
@@ -2719,7 +2719,7 @@
         </w:tc>
         <w:tc>
           <w:tcPr>
-            <w:tcW w:type="dxa" w:w="2664"/>
+            <w:tcW w:type="dxa" w:w="2628"/>
             <w:shd w:fill="1E3A8A"/>
             <w:tcMar>
               <w:top w:w="40" w:type="dxa"/>
@@ -2736,7 +2736,7 @@
               <w:rPr>
                 <w:b/>
                 <w:color w:val="FFFFFF"/>
-                <w:sz w:val="15"/>
+                <w:sz w:val="16"/>
               </w:rPr>
               <w:t>Disparity / Signature</w:t>
             </w:r>
@@ -2746,7 +2746,7 @@
       <w:tr>
         <w:tc>
           <w:tcPr>
-            <w:tcW w:type="dxa" w:w="2664"/>
+            <w:tcW w:type="dxa" w:w="2628"/>
             <w:tcMar>
               <w:top w:w="35" w:type="dxa"/>
               <w:bottom w:w="35" w:type="dxa"/>
@@ -2760,7 +2760,7 @@
             </w:pPr>
             <w:r>
               <w:rPr>
-                <w:sz w:val="15"/>
+                <w:sz w:val="16"/>
               </w:rPr>
               <w:t>Homeownership Rate (housing = A152)</w:t>
             </w:r>
@@ -2768,7 +2768,7 @@
         </w:tc>
         <w:tc>
           <w:tcPr>
-            <w:tcW w:type="dxa" w:w="2664"/>
+            <w:tcW w:type="dxa" w:w="2628"/>
             <w:tcMar>
               <w:top w:w="35" w:type="dxa"/>
               <w:bottom w:w="35" w:type="dxa"/>
@@ -2782,7 +2782,7 @@
             </w:pPr>
             <w:r>
               <w:rPr>
-                <w:sz w:val="15"/>
+                <w:sz w:val="16"/>
               </w:rPr>
               <w:t>74.00%</w:t>
             </w:r>
@@ -2790,7 +2790,7 @@
         </w:tc>
         <w:tc>
           <w:tcPr>
-            <w:tcW w:type="dxa" w:w="2664"/>
+            <w:tcW w:type="dxa" w:w="2628"/>
             <w:tcMar>
               <w:top w:w="35" w:type="dxa"/>
               <w:bottom w:w="35" w:type="dxa"/>
@@ -2804,7 +2804,7 @@
             </w:pPr>
             <w:r>
               <w:rPr>
-                <w:sz w:val="15"/>
+                <w:sz w:val="16"/>
               </w:rPr>
               <w:t>83.33%</w:t>
             </w:r>
@@ -2812,7 +2812,7 @@
         </w:tc>
         <w:tc>
           <w:tcPr>
-            <w:tcW w:type="dxa" w:w="2664"/>
+            <w:tcW w:type="dxa" w:w="2628"/>
             <w:tcMar>
               <w:top w:w="35" w:type="dxa"/>
               <w:bottom w:w="35" w:type="dxa"/>
@@ -2826,7 +2826,7 @@
             </w:pPr>
             <w:r>
               <w:rPr>
-                <w:sz w:val="15"/>
+                <w:sz w:val="16"/>
               </w:rPr>
               <w:t>+9.33% Over-Represented</w:t>
             </w:r>
@@ -2836,7 +2836,7 @@
       <w:tr>
         <w:tc>
           <w:tcPr>
-            <w:tcW w:type="dxa" w:w="2664"/>
+            <w:tcW w:type="dxa" w:w="2628"/>
             <w:shd w:fill="F8FAFC"/>
             <w:tcMar>
               <w:top w:w="35" w:type="dxa"/>
@@ -2851,7 +2851,7 @@
             </w:pPr>
             <w:r>
               <w:rPr>
-                <w:sz w:val="15"/>
+                <w:sz w:val="16"/>
               </w:rPr>
               <w:t>Moderate Checking (A12: 0–200 DM)</w:t>
             </w:r>
@@ -2859,7 +2859,7 @@
         </w:tc>
         <w:tc>
           <w:tcPr>
-            <w:tcW w:type="dxa" w:w="2664"/>
+            <w:tcW w:type="dxa" w:w="2628"/>
             <w:shd w:fill="F8FAFC"/>
             <w:tcMar>
               <w:top w:w="35" w:type="dxa"/>
@@ -2874,7 +2874,7 @@
             </w:pPr>
             <w:r>
               <w:rPr>
-                <w:sz w:val="15"/>
+                <w:sz w:val="16"/>
               </w:rPr>
               <w:t>23.00%</w:t>
             </w:r>
@@ -2882,7 +2882,7 @@
         </w:tc>
         <w:tc>
           <w:tcPr>
-            <w:tcW w:type="dxa" w:w="2664"/>
+            <w:tcW w:type="dxa" w:w="2628"/>
             <w:shd w:fill="F8FAFC"/>
             <w:tcMar>
               <w:top w:w="35" w:type="dxa"/>
@@ -2897,7 +2897,7 @@
             </w:pPr>
             <w:r>
               <w:rPr>
-                <w:sz w:val="15"/>
+                <w:sz w:val="16"/>
               </w:rPr>
               <w:t>45.83%</w:t>
             </w:r>
@@ -2905,7 +2905,7 @@
         </w:tc>
         <w:tc>
           <w:tcPr>
-            <w:tcW w:type="dxa" w:w="2664"/>
+            <w:tcW w:type="dxa" w:w="2628"/>
             <w:shd w:fill="FEE2E2"/>
             <w:tcMar>
               <w:top w:w="35" w:type="dxa"/>
@@ -2921,7 +2921,7 @@
             <w:r>
               <w:rPr>
                 <w:b/>
-                <w:sz w:val="15"/>
+                <w:sz w:val="16"/>
               </w:rPr>
               <w:t>Nearly Double Baseline (+22.83%)</w:t>
             </w:r>
@@ -2931,7 +2931,7 @@
       <w:tr>
         <w:tc>
           <w:tcPr>
-            <w:tcW w:type="dxa" w:w="2664"/>
+            <w:tcW w:type="dxa" w:w="2628"/>
             <w:tcMar>
               <w:top w:w="35" w:type="dxa"/>
               <w:bottom w:w="35" w:type="dxa"/>
@@ -2945,7 +2945,7 @@
             </w:pPr>
             <w:r>
               <w:rPr>
-                <w:sz w:val="15"/>
+                <w:sz w:val="16"/>
               </w:rPr>
               <w:t>Clean Existing Credit History (A32)</w:t>
             </w:r>
@@ -2953,7 +2953,7 @@
         </w:tc>
         <w:tc>
           <w:tcPr>
-            <w:tcW w:type="dxa" w:w="2664"/>
+            <w:tcW w:type="dxa" w:w="2628"/>
             <w:tcMar>
               <w:top w:w="35" w:type="dxa"/>
               <w:bottom w:w="35" w:type="dxa"/>
@@ -2967,7 +2967,7 @@
             </w:pPr>
             <w:r>
               <w:rPr>
-                <w:sz w:val="15"/>
+                <w:sz w:val="16"/>
               </w:rPr>
               <w:t>53.67%</w:t>
             </w:r>
@@ -2975,7 +2975,7 @@
         </w:tc>
         <w:tc>
           <w:tcPr>
-            <w:tcW w:type="dxa" w:w="2664"/>
+            <w:tcW w:type="dxa" w:w="2628"/>
             <w:tcMar>
               <w:top w:w="35" w:type="dxa"/>
               <w:bottom w:w="35" w:type="dxa"/>
@@ -2989,7 +2989,7 @@
             </w:pPr>
             <w:r>
               <w:rPr>
-                <w:sz w:val="15"/>
+                <w:sz w:val="16"/>
               </w:rPr>
               <w:t>54.17%</w:t>
             </w:r>
@@ -2997,7 +2997,7 @@
         </w:tc>
         <w:tc>
           <w:tcPr>
-            <w:tcW w:type="dxa" w:w="2664"/>
+            <w:tcW w:type="dxa" w:w="2628"/>
             <w:tcMar>
               <w:top w:w="35" w:type="dxa"/>
               <w:bottom w:w="35" w:type="dxa"/>
@@ -3011,7 +3011,7 @@
             </w:pPr>
             <w:r>
               <w:rPr>
-                <w:sz w:val="15"/>
+                <w:sz w:val="16"/>
               </w:rPr>
               <w:t>Parity with Clean Baseline</w:t>
             </w:r>
@@ -3021,7 +3021,7 @@
       <w:tr>
         <w:tc>
           <w:tcPr>
-            <w:tcW w:type="dxa" w:w="2664"/>
+            <w:tcW w:type="dxa" w:w="2628"/>
             <w:shd w:fill="F8FAFC"/>
             <w:tcMar>
               <w:top w:w="35" w:type="dxa"/>
@@ -3036,7 +3036,7 @@
             </w:pPr>
             <w:r>
               <w:rPr>
-                <w:sz w:val="15"/>
+                <w:sz w:val="16"/>
               </w:rPr>
               <w:t>Mean Requested Credit Obligation</w:t>
             </w:r>
@@ -3044,7 +3044,7 @@
         </w:tc>
         <w:tc>
           <w:tcPr>
-            <w:tcW w:type="dxa" w:w="2664"/>
+            <w:tcW w:type="dxa" w:w="2628"/>
             <w:shd w:fill="F8FAFC"/>
             <w:tcMar>
               <w:top w:w="35" w:type="dxa"/>
@@ -3059,7 +3059,7 @@
             </w:pPr>
             <w:r>
               <w:rPr>
-                <w:sz w:val="15"/>
+                <w:sz w:val="16"/>
               </w:rPr>
               <w:t>3,040.18 DM</w:t>
             </w:r>
@@ -3067,7 +3067,7 @@
         </w:tc>
         <w:tc>
           <w:tcPr>
-            <w:tcW w:type="dxa" w:w="2664"/>
+            <w:tcW w:type="dxa" w:w="2628"/>
             <w:shd w:fill="F8FAFC"/>
             <w:tcMar>
               <w:top w:w="35" w:type="dxa"/>
@@ -3082,7 +3082,7 @@
             </w:pPr>
             <w:r>
               <w:rPr>
-                <w:sz w:val="15"/>
+                <w:sz w:val="16"/>
               </w:rPr>
               <w:t>3,337.50 DM</w:t>
             </w:r>
@@ -3090,7 +3090,7 @@
         </w:tc>
         <w:tc>
           <w:tcPr>
-            <w:tcW w:type="dxa" w:w="2664"/>
+            <w:tcW w:type="dxa" w:w="2628"/>
             <w:shd w:fill="F8FAFC"/>
             <w:tcMar>
               <w:top w:w="35" w:type="dxa"/>
@@ -3105,7 +3105,7 @@
             </w:pPr>
             <w:r>
               <w:rPr>
-                <w:sz w:val="15"/>
+                <w:sz w:val="16"/>
               </w:rPr>
               <w:t>+$297.32 DM Heavier Burden</w:t>
             </w:r>
@@ -3115,7 +3115,7 @@
       <w:tr>
         <w:tc>
           <w:tcPr>
-            <w:tcW w:type="dxa" w:w="2664"/>
+            <w:tcW w:type="dxa" w:w="2628"/>
             <w:tcMar>
               <w:top w:w="35" w:type="dxa"/>
               <w:bottom w:w="35" w:type="dxa"/>
@@ -3129,7 +3129,7 @@
             </w:pPr>
             <w:r>
               <w:rPr>
-                <w:sz w:val="15"/>
+                <w:sz w:val="16"/>
               </w:rPr>
               <w:t>Female Representation</w:t>
             </w:r>
@@ -3137,7 +3137,7 @@
         </w:tc>
         <w:tc>
           <w:tcPr>
-            <w:tcW w:type="dxa" w:w="2664"/>
+            <w:tcW w:type="dxa" w:w="2628"/>
             <w:tcMar>
               <w:top w:w="35" w:type="dxa"/>
               <w:bottom w:w="35" w:type="dxa"/>
@@ -3151,7 +3151,7 @@
             </w:pPr>
             <w:r>
               <w:rPr>
-                <w:sz w:val="15"/>
+                <w:sz w:val="16"/>
               </w:rPr>
               <w:t>28.33%</w:t>
             </w:r>
@@ -3159,7 +3159,7 @@
         </w:tc>
         <w:tc>
           <w:tcPr>
-            <w:tcW w:type="dxa" w:w="2664"/>
+            <w:tcW w:type="dxa" w:w="2628"/>
             <w:tcMar>
               <w:top w:w="35" w:type="dxa"/>
               <w:bottom w:w="35" w:type="dxa"/>
@@ -3173,7 +3173,7 @@
             </w:pPr>
             <w:r>
               <w:rPr>
-                <w:sz w:val="15"/>
+                <w:sz w:val="16"/>
               </w:rPr>
               <w:t>20.83%</w:t>
             </w:r>
@@ -3181,7 +3181,7 @@
         </w:tc>
         <w:tc>
           <w:tcPr>
-            <w:tcW w:type="dxa" w:w="2664"/>
+            <w:tcW w:type="dxa" w:w="2628"/>
             <w:tcMar>
               <w:top w:w="35" w:type="dxa"/>
               <w:bottom w:w="35" w:type="dxa"/>
@@ -3195,7 +3195,7 @@
             </w:pPr>
             <w:r>
               <w:rPr>
-                <w:sz w:val="15"/>
+                <w:sz w:val="16"/>
               </w:rPr>
               <w:t>-7.50% Under-Represented</w:t>
             </w:r>
@@ -3205,7 +3205,7 @@
     </w:tbl>
     <w:p>
       <w:r>
-        <w:t>Statistical Failure Mechanism: Logistic regression assumes unregularized linear additivity: z = sum(beta_i * X_i). The model complacently summed positive weights for homeownership (beta = +0.283), moderate checking status (beta = +0.345), and clean credit (beta = +0.263), ignoring the non-linear interaction between loan size and liquidity (credit_amount * checking_status). A 0–200 DM buffer cushions a small loan, but fails entirely against a 3,337.50 DM obligation.</w:t>
+        <w:t>Failure Mechanics: Logistic regression assumes linear additivity: z = sum(beta_i * X_i). The model summed positive weights for homeownership (+0.283) and moderate checking (+0.345), ignoring the non-linear interaction between loan size and liquidity (credit_amount * checking_status). A 200 DM buffer cushions small loans, but fails against a 3,337.50 DM debt.</w:t>
       </w:r>
     </w:p>
     <w:p>
@@ -3216,7 +3216,7 @@
       <w:r>
         <w:drawing>
           <wp:inline xmlns:a="http://schemas.openxmlformats.org/drawingml/2006/main" xmlns:pic="http://schemas.openxmlformats.org/drawingml/2006/picture">
-            <wp:extent cx="4114800" cy="1469571"/>
+            <wp:extent cx="4023360" cy="1436914"/>
             <wp:docPr id="4" name="Picture 4"/>
             <wp:cNvGraphicFramePr>
               <a:graphicFrameLocks noChangeAspect="1"/>
@@ -3237,7 +3237,7 @@
                   <pic:spPr>
                     <a:xfrm>
                       <a:off x="0" y="0"/>
-                      <a:ext cx="4114800" cy="1469571"/>
+                      <a:ext cx="4023360" cy="1436914"/>
                     </a:xfrm>
                     <a:prstGeom prst="rect"/>
                   </pic:spPr>
@@ -3251,13 +3251,13 @@
     <w:p>
       <w:pPr>
         <w:keepNext/>
-        <w:spacing w:before="120" w:after="40"/>
+        <w:spacing w:before="140" w:after="40"/>
       </w:pPr>
       <w:r>
         <w:rPr>
           <w:b/>
           <w:color w:val="1E3A8A"/>
-          <w:sz w:val="21"/>
+          <w:sz w:val="22"/>
         </w:rPr>
         <w:t>Part 2.4 — Parametric Fairness Trade-Off Analysis</w:t>
       </w:r>
@@ -3274,20 +3274,20 @@
         <w:tblLook w:firstColumn="1" w:firstRow="1" w:lastColumn="0" w:lastRow="0" w:noHBand="0" w:noVBand="1" w:val="04A0"/>
       </w:tblPr>
       <w:tblGrid>
-        <w:gridCol w:w="1184"/>
-        <w:gridCol w:w="1184"/>
-        <w:gridCol w:w="1184"/>
-        <w:gridCol w:w="1184"/>
-        <w:gridCol w:w="1184"/>
-        <w:gridCol w:w="1184"/>
-        <w:gridCol w:w="1184"/>
-        <w:gridCol w:w="1184"/>
-        <w:gridCol w:w="1184"/>
+        <w:gridCol w:w="1168"/>
+        <w:gridCol w:w="1168"/>
+        <w:gridCol w:w="1168"/>
+        <w:gridCol w:w="1168"/>
+        <w:gridCol w:w="1168"/>
+        <w:gridCol w:w="1168"/>
+        <w:gridCol w:w="1168"/>
+        <w:gridCol w:w="1168"/>
+        <w:gridCol w:w="1168"/>
       </w:tblGrid>
       <w:tr>
         <w:tc>
           <w:tcPr>
-            <w:tcW w:type="dxa" w:w="1184"/>
+            <w:tcW w:type="dxa" w:w="1168"/>
             <w:shd w:fill="1E3A8A"/>
             <w:tcMar>
               <w:top w:w="35" w:type="dxa"/>
@@ -3304,7 +3304,7 @@
               <w:rPr>
                 <w:b/>
                 <w:color w:val="FFFFFF"/>
-                <w:sz w:val="14"/>
+                <w:sz w:val="15"/>
               </w:rPr>
               <w:t>Threshold (t)</w:t>
             </w:r>
@@ -3312,7 +3312,7 @@
         </w:tc>
         <w:tc>
           <w:tcPr>
-            <w:tcW w:type="dxa" w:w="1184"/>
+            <w:tcW w:type="dxa" w:w="1168"/>
             <w:shd w:fill="1E3A8A"/>
             <w:tcMar>
               <w:top w:w="35" w:type="dxa"/>
@@ -3329,7 +3329,7 @@
               <w:rPr>
                 <w:b/>
                 <w:color w:val="FFFFFF"/>
-                <w:sz w:val="14"/>
+                <w:sz w:val="15"/>
               </w:rPr>
               <w:t>P(App|F)</w:t>
             </w:r>
@@ -3337,7 +3337,7 @@
         </w:tc>
         <w:tc>
           <w:tcPr>
-            <w:tcW w:type="dxa" w:w="1184"/>
+            <w:tcW w:type="dxa" w:w="1168"/>
             <w:shd w:fill="1E3A8A"/>
             <w:tcMar>
               <w:top w:w="35" w:type="dxa"/>
@@ -3354,7 +3354,7 @@
               <w:rPr>
                 <w:b/>
                 <w:color w:val="FFFFFF"/>
-                <w:sz w:val="14"/>
+                <w:sz w:val="15"/>
               </w:rPr>
               <w:t>P(App|M)</w:t>
             </w:r>
@@ -3362,7 +3362,7 @@
         </w:tc>
         <w:tc>
           <w:tcPr>
-            <w:tcW w:type="dxa" w:w="1184"/>
+            <w:tcW w:type="dxa" w:w="1168"/>
             <w:shd w:fill="1E3A8A"/>
             <w:tcMar>
               <w:top w:w="35" w:type="dxa"/>
@@ -3379,7 +3379,7 @@
               <w:rPr>
                 <w:b/>
                 <w:color w:val="FFFFFF"/>
-                <w:sz w:val="14"/>
+                <w:sz w:val="15"/>
               </w:rPr>
               <w:t>DP</w:t>
             </w:r>
@@ -3387,7 +3387,7 @@
         </w:tc>
         <w:tc>
           <w:tcPr>
-            <w:tcW w:type="dxa" w:w="1184"/>
+            <w:tcW w:type="dxa" w:w="1168"/>
             <w:shd w:fill="1E3A8A"/>
             <w:tcMar>
               <w:top w:w="35" w:type="dxa"/>
@@ -3404,7 +3404,7 @@
               <w:rPr>
                 <w:b/>
                 <w:color w:val="FFFFFF"/>
-                <w:sz w:val="14"/>
+                <w:sz w:val="15"/>
               </w:rPr>
               <w:t>TPR(F)</w:t>
             </w:r>
@@ -3412,7 +3412,7 @@
         </w:tc>
         <w:tc>
           <w:tcPr>
-            <w:tcW w:type="dxa" w:w="1184"/>
+            <w:tcW w:type="dxa" w:w="1168"/>
             <w:shd w:fill="1E3A8A"/>
             <w:tcMar>
               <w:top w:w="35" w:type="dxa"/>
@@ -3429,7 +3429,7 @@
               <w:rPr>
                 <w:b/>
                 <w:color w:val="FFFFFF"/>
-                <w:sz w:val="14"/>
+                <w:sz w:val="15"/>
               </w:rPr>
               <w:t>TPR(M)</w:t>
             </w:r>
@@ -3437,7 +3437,7 @@
         </w:tc>
         <w:tc>
           <w:tcPr>
-            <w:tcW w:type="dxa" w:w="1184"/>
+            <w:tcW w:type="dxa" w:w="1168"/>
             <w:shd w:fill="1E3A8A"/>
             <w:tcMar>
               <w:top w:w="35" w:type="dxa"/>
@@ -3454,7 +3454,7 @@
               <w:rPr>
                 <w:b/>
                 <w:color w:val="FFFFFF"/>
-                <w:sz w:val="14"/>
+                <w:sz w:val="15"/>
               </w:rPr>
               <w:t>EO</w:t>
             </w:r>
@@ -3462,7 +3462,7 @@
         </w:tc>
         <w:tc>
           <w:tcPr>
-            <w:tcW w:type="dxa" w:w="1184"/>
+            <w:tcW w:type="dxa" w:w="1168"/>
             <w:shd w:fill="1E3A8A"/>
             <w:tcMar>
               <w:top w:w="35" w:type="dxa"/>
@@ -3479,7 +3479,7 @@
               <w:rPr>
                 <w:b/>
                 <w:color w:val="FFFFFF"/>
-                <w:sz w:val="14"/>
+                <w:sz w:val="15"/>
               </w:rPr>
               <w:t>PP</w:t>
             </w:r>
@@ -3487,7 +3487,7 @@
         </w:tc>
         <w:tc>
           <w:tcPr>
-            <w:tcW w:type="dxa" w:w="1184"/>
+            <w:tcW w:type="dxa" w:w="1168"/>
             <w:shd w:fill="1E3A8A"/>
             <w:tcMar>
               <w:top w:w="35" w:type="dxa"/>
@@ -3504,7 +3504,7 @@
               <w:rPr>
                 <w:b/>
                 <w:color w:val="FFFFFF"/>
-                <w:sz w:val="14"/>
+                <w:sz w:val="15"/>
               </w:rPr>
               <w:t>Accuracy</w:t>
             </w:r>
@@ -3514,7 +3514,7 @@
       <w:tr>
         <w:tc>
           <w:tcPr>
-            <w:tcW w:type="dxa" w:w="1184"/>
+            <w:tcW w:type="dxa" w:w="1168"/>
             <w:tcMar>
               <w:top w:w="30" w:type="dxa"/>
               <w:bottom w:w="30" w:type="dxa"/>
@@ -3528,7 +3528,7 @@
             </w:pPr>
             <w:r>
               <w:rPr>
-                <w:sz w:val="14"/>
+                <w:sz w:val="15"/>
               </w:rPr>
               <w:t>0.05</w:t>
             </w:r>
@@ -3536,7 +3536,7 @@
         </w:tc>
         <w:tc>
           <w:tcPr>
-            <w:tcW w:type="dxa" w:w="1184"/>
+            <w:tcW w:type="dxa" w:w="1168"/>
             <w:tcMar>
               <w:top w:w="30" w:type="dxa"/>
               <w:bottom w:w="30" w:type="dxa"/>
@@ -3550,7 +3550,7 @@
             </w:pPr>
             <w:r>
               <w:rPr>
-                <w:sz w:val="14"/>
+                <w:sz w:val="15"/>
               </w:rPr>
               <w:t>1.0000</w:t>
             </w:r>
@@ -3558,7 +3558,7 @@
         </w:tc>
         <w:tc>
           <w:tcPr>
-            <w:tcW w:type="dxa" w:w="1184"/>
+            <w:tcW w:type="dxa" w:w="1168"/>
             <w:tcMar>
               <w:top w:w="30" w:type="dxa"/>
               <w:bottom w:w="30" w:type="dxa"/>
@@ -3572,7 +3572,7 @@
             </w:pPr>
             <w:r>
               <w:rPr>
-                <w:sz w:val="14"/>
+                <w:sz w:val="15"/>
               </w:rPr>
               <w:t>1.0000</w:t>
             </w:r>
@@ -3580,7 +3580,7 @@
         </w:tc>
         <w:tc>
           <w:tcPr>
-            <w:tcW w:type="dxa" w:w="1184"/>
+            <w:tcW w:type="dxa" w:w="1168"/>
             <w:tcMar>
               <w:top w:w="30" w:type="dxa"/>
               <w:bottom w:w="30" w:type="dxa"/>
@@ -3594,7 +3594,7 @@
             </w:pPr>
             <w:r>
               <w:rPr>
-                <w:sz w:val="14"/>
+                <w:sz w:val="15"/>
               </w:rPr>
               <w:t>1.0000</w:t>
             </w:r>
@@ -3602,7 +3602,7 @@
         </w:tc>
         <w:tc>
           <w:tcPr>
-            <w:tcW w:type="dxa" w:w="1184"/>
+            <w:tcW w:type="dxa" w:w="1168"/>
             <w:tcMar>
               <w:top w:w="30" w:type="dxa"/>
               <w:bottom w:w="30" w:type="dxa"/>
@@ -3616,7 +3616,7 @@
             </w:pPr>
             <w:r>
               <w:rPr>
-                <w:sz w:val="14"/>
+                <w:sz w:val="15"/>
               </w:rPr>
               <w:t>1.0000</w:t>
             </w:r>
@@ -3624,7 +3624,7 @@
         </w:tc>
         <w:tc>
           <w:tcPr>
-            <w:tcW w:type="dxa" w:w="1184"/>
+            <w:tcW w:type="dxa" w:w="1168"/>
             <w:tcMar>
               <w:top w:w="30" w:type="dxa"/>
               <w:bottom w:w="30" w:type="dxa"/>
@@ -3638,7 +3638,7 @@
             </w:pPr>
             <w:r>
               <w:rPr>
-                <w:sz w:val="14"/>
+                <w:sz w:val="15"/>
               </w:rPr>
               <w:t>1.0000</w:t>
             </w:r>
@@ -3646,7 +3646,7 @@
         </w:tc>
         <w:tc>
           <w:tcPr>
-            <w:tcW w:type="dxa" w:w="1184"/>
+            <w:tcW w:type="dxa" w:w="1168"/>
             <w:tcMar>
               <w:top w:w="30" w:type="dxa"/>
               <w:bottom w:w="30" w:type="dxa"/>
@@ -3660,7 +3660,7 @@
             </w:pPr>
             <w:r>
               <w:rPr>
-                <w:sz w:val="14"/>
+                <w:sz w:val="15"/>
               </w:rPr>
               <w:t>1.0000</w:t>
             </w:r>
@@ -3668,7 +3668,7 @@
         </w:tc>
         <w:tc>
           <w:tcPr>
-            <w:tcW w:type="dxa" w:w="1184"/>
+            <w:tcW w:type="dxa" w:w="1168"/>
             <w:tcMar>
               <w:top w:w="30" w:type="dxa"/>
               <w:bottom w:w="30" w:type="dxa"/>
@@ -3682,7 +3682,7 @@
             </w:pPr>
             <w:r>
               <w:rPr>
-                <w:sz w:val="14"/>
+                <w:sz w:val="15"/>
               </w:rPr>
               <w:t>0.9754</w:t>
             </w:r>
@@ -3690,7 +3690,7 @@
         </w:tc>
         <w:tc>
           <w:tcPr>
-            <w:tcW w:type="dxa" w:w="1184"/>
+            <w:tcW w:type="dxa" w:w="1168"/>
             <w:tcMar>
               <w:top w:w="30" w:type="dxa"/>
               <w:bottom w:w="30" w:type="dxa"/>
@@ -3704,7 +3704,7 @@
             </w:pPr>
             <w:r>
               <w:rPr>
-                <w:sz w:val="14"/>
+                <w:sz w:val="15"/>
               </w:rPr>
               <w:t>70.67%</w:t>
             </w:r>
@@ -3714,7 +3714,7 @@
       <w:tr>
         <w:tc>
           <w:tcPr>
-            <w:tcW w:type="dxa" w:w="1184"/>
+            <w:tcW w:type="dxa" w:w="1168"/>
             <w:shd w:fill="F8FAFC"/>
             <w:tcMar>
               <w:top w:w="30" w:type="dxa"/>
@@ -3729,7 +3729,7 @@
             </w:pPr>
             <w:r>
               <w:rPr>
-                <w:sz w:val="14"/>
+                <w:sz w:val="15"/>
               </w:rPr>
               <w:t>0.15</w:t>
             </w:r>
@@ -3737,7 +3737,7 @@
         </w:tc>
         <w:tc>
           <w:tcPr>
-            <w:tcW w:type="dxa" w:w="1184"/>
+            <w:tcW w:type="dxa" w:w="1168"/>
             <w:shd w:fill="F8FAFC"/>
             <w:tcMar>
               <w:top w:w="30" w:type="dxa"/>
@@ -3752,7 +3752,7 @@
             </w:pPr>
             <w:r>
               <w:rPr>
-                <w:sz w:val="14"/>
+                <w:sz w:val="15"/>
               </w:rPr>
               <w:t>0.9529</w:t>
             </w:r>
@@ -3760,7 +3760,7 @@
         </w:tc>
         <w:tc>
           <w:tcPr>
-            <w:tcW w:type="dxa" w:w="1184"/>
+            <w:tcW w:type="dxa" w:w="1168"/>
             <w:shd w:fill="F8FAFC"/>
             <w:tcMar>
               <w:top w:w="30" w:type="dxa"/>
@@ -3775,7 +3775,7 @@
             </w:pPr>
             <w:r>
               <w:rPr>
-                <w:sz w:val="14"/>
+                <w:sz w:val="15"/>
               </w:rPr>
               <w:t>0.9860</w:t>
             </w:r>
@@ -3783,7 +3783,7 @@
         </w:tc>
         <w:tc>
           <w:tcPr>
-            <w:tcW w:type="dxa" w:w="1184"/>
+            <w:tcW w:type="dxa" w:w="1168"/>
             <w:shd w:fill="F8FAFC"/>
             <w:tcMar>
               <w:top w:w="30" w:type="dxa"/>
@@ -3798,7 +3798,7 @@
             </w:pPr>
             <w:r>
               <w:rPr>
-                <w:sz w:val="14"/>
+                <w:sz w:val="15"/>
               </w:rPr>
               <w:t>0.9664</w:t>
             </w:r>
@@ -3806,7 +3806,7 @@
         </w:tc>
         <w:tc>
           <w:tcPr>
-            <w:tcW w:type="dxa" w:w="1184"/>
+            <w:tcW w:type="dxa" w:w="1168"/>
             <w:shd w:fill="F8FAFC"/>
             <w:tcMar>
               <w:top w:w="30" w:type="dxa"/>
@@ -3821,7 +3821,7 @@
             </w:pPr>
             <w:r>
               <w:rPr>
-                <w:sz w:val="14"/>
+                <w:sz w:val="15"/>
               </w:rPr>
               <w:t>0.9831</w:t>
             </w:r>
@@ -3829,7 +3829,7 @@
         </w:tc>
         <w:tc>
           <w:tcPr>
-            <w:tcW w:type="dxa" w:w="1184"/>
+            <w:tcW w:type="dxa" w:w="1168"/>
             <w:shd w:fill="F8FAFC"/>
             <w:tcMar>
               <w:top w:w="30" w:type="dxa"/>
@@ -3844,7 +3844,7 @@
             </w:pPr>
             <w:r>
               <w:rPr>
-                <w:sz w:val="14"/>
+                <w:sz w:val="15"/>
               </w:rPr>
               <w:t>1.0000</w:t>
             </w:r>
@@ -3852,7 +3852,7 @@
         </w:tc>
         <w:tc>
           <w:tcPr>
-            <w:tcW w:type="dxa" w:w="1184"/>
+            <w:tcW w:type="dxa" w:w="1168"/>
             <w:shd w:fill="F8FAFC"/>
             <w:tcMar>
               <w:top w:w="30" w:type="dxa"/>
@@ -3867,7 +3867,7 @@
             </w:pPr>
             <w:r>
               <w:rPr>
-                <w:sz w:val="14"/>
+                <w:sz w:val="15"/>
               </w:rPr>
               <w:t>0.9296</w:t>
             </w:r>
@@ -3875,7 +3875,7 @@
         </w:tc>
         <w:tc>
           <w:tcPr>
-            <w:tcW w:type="dxa" w:w="1184"/>
+            <w:tcW w:type="dxa" w:w="1168"/>
             <w:shd w:fill="F8FAFC"/>
             <w:tcMar>
               <w:top w:w="30" w:type="dxa"/>
@@ -3890,7 +3890,7 @@
             </w:pPr>
             <w:r>
               <w:rPr>
-                <w:sz w:val="14"/>
+                <w:sz w:val="15"/>
               </w:rPr>
               <w:t>0.9922</w:t>
             </w:r>
@@ -3898,7 +3898,7 @@
         </w:tc>
         <w:tc>
           <w:tcPr>
-            <w:tcW w:type="dxa" w:w="1184"/>
+            <w:tcW w:type="dxa" w:w="1168"/>
             <w:shd w:fill="F8FAFC"/>
             <w:tcMar>
               <w:top w:w="30" w:type="dxa"/>
@@ -3913,7 +3913,7 @@
             </w:pPr>
             <w:r>
               <w:rPr>
-                <w:sz w:val="14"/>
+                <w:sz w:val="15"/>
               </w:rPr>
               <w:t>72.33%</w:t>
             </w:r>
@@ -3923,7 +3923,7 @@
       <w:tr>
         <w:tc>
           <w:tcPr>
-            <w:tcW w:type="dxa" w:w="1184"/>
+            <w:tcW w:type="dxa" w:w="1168"/>
             <w:tcMar>
               <w:top w:w="30" w:type="dxa"/>
               <w:bottom w:w="30" w:type="dxa"/>
@@ -3937,7 +3937,7 @@
             </w:pPr>
             <w:r>
               <w:rPr>
-                <w:sz w:val="14"/>
+                <w:sz w:val="15"/>
               </w:rPr>
               <w:t>0.25</w:t>
             </w:r>
@@ -3945,7 +3945,7 @@
         </w:tc>
         <w:tc>
           <w:tcPr>
-            <w:tcW w:type="dxa" w:w="1184"/>
+            <w:tcW w:type="dxa" w:w="1168"/>
             <w:tcMar>
               <w:top w:w="30" w:type="dxa"/>
               <w:bottom w:w="30" w:type="dxa"/>
@@ -3959,7 +3959,7 @@
             </w:pPr>
             <w:r>
               <w:rPr>
-                <w:sz w:val="14"/>
+                <w:sz w:val="15"/>
               </w:rPr>
               <w:t>0.8941</w:t>
             </w:r>
@@ -3967,7 +3967,7 @@
         </w:tc>
         <w:tc>
           <w:tcPr>
-            <w:tcW w:type="dxa" w:w="1184"/>
+            <w:tcW w:type="dxa" w:w="1168"/>
             <w:tcMar>
               <w:top w:w="30" w:type="dxa"/>
               <w:bottom w:w="30" w:type="dxa"/>
@@ -3981,7 +3981,7 @@
             </w:pPr>
             <w:r>
               <w:rPr>
-                <w:sz w:val="14"/>
+                <w:sz w:val="15"/>
               </w:rPr>
               <w:t>0.9628</w:t>
             </w:r>
@@ -3989,7 +3989,7 @@
         </w:tc>
         <w:tc>
           <w:tcPr>
-            <w:tcW w:type="dxa" w:w="1184"/>
+            <w:tcW w:type="dxa" w:w="1168"/>
             <w:tcMar>
               <w:top w:w="30" w:type="dxa"/>
               <w:bottom w:w="30" w:type="dxa"/>
@@ -4003,7 +4003,7 @@
             </w:pPr>
             <w:r>
               <w:rPr>
-                <w:sz w:val="14"/>
+                <w:sz w:val="15"/>
               </w:rPr>
               <w:t>0.9287</w:t>
             </w:r>
@@ -4011,7 +4011,7 @@
         </w:tc>
         <w:tc>
           <w:tcPr>
-            <w:tcW w:type="dxa" w:w="1184"/>
+            <w:tcW w:type="dxa" w:w="1168"/>
             <w:tcMar>
               <w:top w:w="30" w:type="dxa"/>
               <w:bottom w:w="30" w:type="dxa"/>
@@ -4025,7 +4025,7 @@
             </w:pPr>
             <w:r>
               <w:rPr>
-                <w:sz w:val="14"/>
+                <w:sz w:val="15"/>
               </w:rPr>
               <w:t>0.9661</w:t>
             </w:r>
@@ -4033,7 +4033,7 @@
         </w:tc>
         <w:tc>
           <w:tcPr>
-            <w:tcW w:type="dxa" w:w="1184"/>
+            <w:tcW w:type="dxa" w:w="1168"/>
             <w:tcMar>
               <w:top w:w="30" w:type="dxa"/>
               <w:bottom w:w="30" w:type="dxa"/>
@@ -4047,7 +4047,7 @@
             </w:pPr>
             <w:r>
               <w:rPr>
-                <w:sz w:val="14"/>
+                <w:sz w:val="15"/>
               </w:rPr>
               <w:t>0.9935</w:t>
             </w:r>
@@ -4055,7 +4055,7 @@
         </w:tc>
         <w:tc>
           <w:tcPr>
-            <w:tcW w:type="dxa" w:w="1184"/>
+            <w:tcW w:type="dxa" w:w="1168"/>
             <w:tcMar>
               <w:top w:w="30" w:type="dxa"/>
               <w:bottom w:w="30" w:type="dxa"/>
@@ -4069,7 +4069,7 @@
             </w:pPr>
             <w:r>
               <w:rPr>
-                <w:sz w:val="14"/>
+                <w:sz w:val="15"/>
               </w:rPr>
               <w:t>0.8238</w:t>
             </w:r>
@@ -4077,7 +4077,7 @@
         </w:tc>
         <w:tc>
           <w:tcPr>
-            <w:tcW w:type="dxa" w:w="1184"/>
+            <w:tcW w:type="dxa" w:w="1168"/>
             <w:tcMar>
               <w:top w:w="30" w:type="dxa"/>
               <w:bottom w:w="30" w:type="dxa"/>
@@ -4091,7 +4091,7 @@
             </w:pPr>
             <w:r>
               <w:rPr>
-                <w:sz w:val="14"/>
+                <w:sz w:val="15"/>
               </w:rPr>
               <w:t>1.0214</w:t>
             </w:r>
@@ -4099,7 +4099,7 @@
         </w:tc>
         <w:tc>
           <w:tcPr>
-            <w:tcW w:type="dxa" w:w="1184"/>
+            <w:tcW w:type="dxa" w:w="1168"/>
             <w:tcMar>
               <w:top w:w="30" w:type="dxa"/>
               <w:bottom w:w="30" w:type="dxa"/>
@@ -4113,7 +4113,7 @@
             </w:pPr>
             <w:r>
               <w:rPr>
-                <w:sz w:val="14"/>
+                <w:sz w:val="15"/>
               </w:rPr>
               <w:t>74.33%</w:t>
             </w:r>
@@ -4123,7 +4123,7 @@
       <w:tr>
         <w:tc>
           <w:tcPr>
-            <w:tcW w:type="dxa" w:w="1184"/>
+            <w:tcW w:type="dxa" w:w="1168"/>
             <w:shd w:fill="DBEAFE"/>
             <w:tcMar>
               <w:top w:w="30" w:type="dxa"/>
@@ -4139,7 +4139,7 @@
             <w:r>
               <w:rPr>
                 <w:b/>
-                <w:sz w:val="14"/>
+                <w:sz w:val="15"/>
               </w:rPr>
               <w:t>0.35 (Rec)</w:t>
             </w:r>
@@ -4147,7 +4147,7 @@
         </w:tc>
         <w:tc>
           <w:tcPr>
-            <w:tcW w:type="dxa" w:w="1184"/>
+            <w:tcW w:type="dxa" w:w="1168"/>
             <w:shd w:fill="DBEAFE"/>
             <w:tcMar>
               <w:top w:w="30" w:type="dxa"/>
@@ -4163,7 +4163,7 @@
             <w:r>
               <w:rPr>
                 <w:b/>
-                <w:sz w:val="14"/>
+                <w:sz w:val="15"/>
               </w:rPr>
               <w:t>0.8471</w:t>
             </w:r>
@@ -4171,7 +4171,7 @@
         </w:tc>
         <w:tc>
           <w:tcPr>
-            <w:tcW w:type="dxa" w:w="1184"/>
+            <w:tcW w:type="dxa" w:w="1168"/>
             <w:shd w:fill="DBEAFE"/>
             <w:tcMar>
               <w:top w:w="30" w:type="dxa"/>
@@ -4187,7 +4187,7 @@
             <w:r>
               <w:rPr>
                 <w:b/>
-                <w:sz w:val="14"/>
+                <w:sz w:val="15"/>
               </w:rPr>
               <w:t>0.9116</w:t>
             </w:r>
@@ -4195,7 +4195,7 @@
         </w:tc>
         <w:tc>
           <w:tcPr>
-            <w:tcW w:type="dxa" w:w="1184"/>
+            <w:tcW w:type="dxa" w:w="1168"/>
             <w:shd w:fill="DBEAFE"/>
             <w:tcMar>
               <w:top w:w="30" w:type="dxa"/>
@@ -4211,7 +4211,7 @@
             <w:r>
               <w:rPr>
                 <w:b/>
-                <w:sz w:val="14"/>
+                <w:sz w:val="15"/>
               </w:rPr>
               <w:t>0.9292</w:t>
             </w:r>
@@ -4219,7 +4219,7 @@
         </w:tc>
         <w:tc>
           <w:tcPr>
-            <w:tcW w:type="dxa" w:w="1184"/>
+            <w:tcW w:type="dxa" w:w="1168"/>
             <w:shd w:fill="DBEAFE"/>
             <w:tcMar>
               <w:top w:w="30" w:type="dxa"/>
@@ -4235,7 +4235,7 @@
             <w:r>
               <w:rPr>
                 <w:b/>
-                <w:sz w:val="14"/>
+                <w:sz w:val="15"/>
               </w:rPr>
               <w:t>0.9322</w:t>
             </w:r>
@@ -4243,7 +4243,7 @@
         </w:tc>
         <w:tc>
           <w:tcPr>
-            <w:tcW w:type="dxa" w:w="1184"/>
+            <w:tcW w:type="dxa" w:w="1168"/>
             <w:shd w:fill="DBEAFE"/>
             <w:tcMar>
               <w:top w:w="30" w:type="dxa"/>
@@ -4259,7 +4259,7 @@
             <w:r>
               <w:rPr>
                 <w:b/>
-                <w:sz w:val="14"/>
+                <w:sz w:val="15"/>
               </w:rPr>
               <w:t>0.9542</w:t>
             </w:r>
@@ -4267,7 +4267,7 @@
         </w:tc>
         <w:tc>
           <w:tcPr>
-            <w:tcW w:type="dxa" w:w="1184"/>
+            <w:tcW w:type="dxa" w:w="1168"/>
             <w:shd w:fill="DBEAFE"/>
             <w:tcMar>
               <w:top w:w="30" w:type="dxa"/>
@@ -4283,7 +4283,7 @@
             <w:r>
               <w:rPr>
                 <w:b/>
-                <w:sz w:val="14"/>
+                <w:sz w:val="15"/>
               </w:rPr>
               <w:t>0.8108</w:t>
             </w:r>
@@ -4291,7 +4291,7 @@
         </w:tc>
         <w:tc>
           <w:tcPr>
-            <w:tcW w:type="dxa" w:w="1184"/>
+            <w:tcW w:type="dxa" w:w="1168"/>
             <w:shd w:fill="DBEAFE"/>
             <w:tcMar>
               <w:top w:w="30" w:type="dxa"/>
@@ -4307,7 +4307,7 @@
             <w:r>
               <w:rPr>
                 <w:b/>
-                <w:sz w:val="14"/>
+                <w:sz w:val="15"/>
               </w:rPr>
               <w:t>1.0255</w:t>
             </w:r>
@@ -4315,7 +4315,7 @@
         </w:tc>
         <w:tc>
           <w:tcPr>
-            <w:tcW w:type="dxa" w:w="1184"/>
+            <w:tcW w:type="dxa" w:w="1168"/>
             <w:shd w:fill="DBEAFE"/>
             <w:tcMar>
               <w:top w:w="30" w:type="dxa"/>
@@ -4331,7 +4331,7 @@
             <w:r>
               <w:rPr>
                 <w:b/>
-                <w:sz w:val="14"/>
+                <w:sz w:val="15"/>
               </w:rPr>
               <w:t>74.00%</w:t>
             </w:r>
@@ -4341,7 +4341,7 @@
       <w:tr>
         <w:tc>
           <w:tcPr>
-            <w:tcW w:type="dxa" w:w="1184"/>
+            <w:tcW w:type="dxa" w:w="1168"/>
             <w:tcMar>
               <w:top w:w="30" w:type="dxa"/>
               <w:bottom w:w="30" w:type="dxa"/>
@@ -4355,7 +4355,7 @@
             </w:pPr>
             <w:r>
               <w:rPr>
-                <w:sz w:val="14"/>
+                <w:sz w:val="15"/>
               </w:rPr>
               <w:t>0.45</w:t>
             </w:r>
@@ -4363,7 +4363,7 @@
         </w:tc>
         <w:tc>
           <w:tcPr>
-            <w:tcW w:type="dxa" w:w="1184"/>
+            <w:tcW w:type="dxa" w:w="1168"/>
             <w:tcMar>
               <w:top w:w="30" w:type="dxa"/>
               <w:bottom w:w="30" w:type="dxa"/>
@@ -4377,7 +4377,7 @@
             </w:pPr>
             <w:r>
               <w:rPr>
-                <w:sz w:val="14"/>
+                <w:sz w:val="15"/>
               </w:rPr>
               <w:t>0.7647</w:t>
             </w:r>
@@ -4385,7 +4385,7 @@
         </w:tc>
         <w:tc>
           <w:tcPr>
-            <w:tcW w:type="dxa" w:w="1184"/>
+            <w:tcW w:type="dxa" w:w="1168"/>
             <w:tcMar>
               <w:top w:w="30" w:type="dxa"/>
               <w:bottom w:w="30" w:type="dxa"/>
@@ -4399,7 +4399,7 @@
             </w:pPr>
             <w:r>
               <w:rPr>
-                <w:sz w:val="14"/>
+                <w:sz w:val="15"/>
               </w:rPr>
               <w:t>0.8605</w:t>
             </w:r>
@@ -4407,7 +4407,7 @@
         </w:tc>
         <w:tc>
           <w:tcPr>
-            <w:tcW w:type="dxa" w:w="1184"/>
+            <w:tcW w:type="dxa" w:w="1168"/>
             <w:tcMar>
               <w:top w:w="30" w:type="dxa"/>
               <w:bottom w:w="30" w:type="dxa"/>
@@ -4421,7 +4421,7 @@
             </w:pPr>
             <w:r>
               <w:rPr>
-                <w:sz w:val="14"/>
+                <w:sz w:val="15"/>
               </w:rPr>
               <w:t>0.8887</w:t>
             </w:r>
@@ -4429,7 +4429,7 @@
         </w:tc>
         <w:tc>
           <w:tcPr>
-            <w:tcW w:type="dxa" w:w="1184"/>
+            <w:tcW w:type="dxa" w:w="1168"/>
             <w:tcMar>
               <w:top w:w="30" w:type="dxa"/>
               <w:bottom w:w="30" w:type="dxa"/>
@@ -4443,7 +4443,7 @@
             </w:pPr>
             <w:r>
               <w:rPr>
-                <w:sz w:val="14"/>
+                <w:sz w:val="15"/>
               </w:rPr>
               <w:t>0.8983</w:t>
             </w:r>
@@ -4451,7 +4451,7 @@
         </w:tc>
         <w:tc>
           <w:tcPr>
-            <w:tcW w:type="dxa" w:w="1184"/>
+            <w:tcW w:type="dxa" w:w="1168"/>
             <w:tcMar>
               <w:top w:w="30" w:type="dxa"/>
               <w:bottom w:w="30" w:type="dxa"/>
@@ -4465,7 +4465,7 @@
             </w:pPr>
             <w:r>
               <w:rPr>
-                <w:sz w:val="14"/>
+                <w:sz w:val="15"/>
               </w:rPr>
               <w:t>0.9085</w:t>
             </w:r>
@@ -4473,7 +4473,7 @@
         </w:tc>
         <w:tc>
           <w:tcPr>
-            <w:tcW w:type="dxa" w:w="1184"/>
+            <w:tcW w:type="dxa" w:w="1168"/>
             <w:tcMar>
               <w:top w:w="30" w:type="dxa"/>
               <w:bottom w:w="30" w:type="dxa"/>
@@ -4487,7 +4487,7 @@
             </w:pPr>
             <w:r>
               <w:rPr>
-                <w:sz w:val="14"/>
+                <w:sz w:val="15"/>
               </w:rPr>
               <w:t>0.6221</w:t>
             </w:r>
@@ -4495,7 +4495,7 @@
         </w:tc>
         <w:tc>
           <w:tcPr>
-            <w:tcW w:type="dxa" w:w="1184"/>
+            <w:tcW w:type="dxa" w:w="1168"/>
             <w:tcMar>
               <w:top w:w="30" w:type="dxa"/>
               <w:bottom w:w="30" w:type="dxa"/>
@@ -4509,7 +4509,7 @@
             </w:pPr>
             <w:r>
               <w:rPr>
-                <w:sz w:val="14"/>
+                <w:sz w:val="15"/>
               </w:rPr>
               <w:t>1.0852</w:t>
             </w:r>
@@ -4517,7 +4517,7 @@
         </w:tc>
         <w:tc>
           <w:tcPr>
-            <w:tcW w:type="dxa" w:w="1184"/>
+            <w:tcW w:type="dxa" w:w="1168"/>
             <w:tcMar>
               <w:top w:w="30" w:type="dxa"/>
               <w:bottom w:w="30" w:type="dxa"/>
@@ -4531,7 +4531,7 @@
             </w:pPr>
             <w:r>
               <w:rPr>
-                <w:sz w:val="14"/>
+                <w:sz w:val="15"/>
               </w:rPr>
               <w:t>74.00%</w:t>
             </w:r>
@@ -4541,7 +4541,7 @@
       <w:tr>
         <w:tc>
           <w:tcPr>
-            <w:tcW w:type="dxa" w:w="1184"/>
+            <w:tcW w:type="dxa" w:w="1168"/>
             <w:shd w:fill="FEE2E2"/>
             <w:tcMar>
               <w:top w:w="30" w:type="dxa"/>
@@ -4556,7 +4556,7 @@
             </w:pPr>
             <w:r>
               <w:rPr>
-                <w:sz w:val="14"/>
+                <w:sz w:val="15"/>
               </w:rPr>
               <w:t>0.55 (Peak)</w:t>
             </w:r>
@@ -4564,7 +4564,7 @@
         </w:tc>
         <w:tc>
           <w:tcPr>
-            <w:tcW w:type="dxa" w:w="1184"/>
+            <w:tcW w:type="dxa" w:w="1168"/>
             <w:shd w:fill="FEE2E2"/>
             <w:tcMar>
               <w:top w:w="30" w:type="dxa"/>
@@ -4579,7 +4579,7 @@
             </w:pPr>
             <w:r>
               <w:rPr>
-                <w:sz w:val="14"/>
+                <w:sz w:val="15"/>
               </w:rPr>
               <w:t>0.6824</w:t>
             </w:r>
@@ -4587,7 +4587,7 @@
         </w:tc>
         <w:tc>
           <w:tcPr>
-            <w:tcW w:type="dxa" w:w="1184"/>
+            <w:tcW w:type="dxa" w:w="1168"/>
             <w:shd w:fill="FEE2E2"/>
             <w:tcMar>
               <w:top w:w="30" w:type="dxa"/>
@@ -4602,7 +4602,7 @@
             </w:pPr>
             <w:r>
               <w:rPr>
-                <w:sz w:val="14"/>
+                <w:sz w:val="15"/>
               </w:rPr>
               <w:t>0.8047</w:t>
             </w:r>
@@ -4610,7 +4610,7 @@
         </w:tc>
         <w:tc>
           <w:tcPr>
-            <w:tcW w:type="dxa" w:w="1184"/>
+            <w:tcW w:type="dxa" w:w="1168"/>
             <w:shd w:fill="FEE2E2"/>
             <w:tcMar>
               <w:top w:w="30" w:type="dxa"/>
@@ -4625,7 +4625,7 @@
             </w:pPr>
             <w:r>
               <w:rPr>
-                <w:sz w:val="14"/>
+                <w:sz w:val="15"/>
               </w:rPr>
               <w:t>0.8480</w:t>
             </w:r>
@@ -4633,7 +4633,7 @@
         </w:tc>
         <w:tc>
           <w:tcPr>
-            <w:tcW w:type="dxa" w:w="1184"/>
+            <w:tcW w:type="dxa" w:w="1168"/>
             <w:shd w:fill="FEE2E2"/>
             <w:tcMar>
               <w:top w:w="30" w:type="dxa"/>
@@ -4648,7 +4648,7 @@
             </w:pPr>
             <w:r>
               <w:rPr>
-                <w:sz w:val="14"/>
+                <w:sz w:val="15"/>
               </w:rPr>
               <w:t>0.8475</w:t>
             </w:r>
@@ -4656,7 +4656,7 @@
         </w:tc>
         <w:tc>
           <w:tcPr>
-            <w:tcW w:type="dxa" w:w="1184"/>
+            <w:tcW w:type="dxa" w:w="1168"/>
             <w:shd w:fill="FEE2E2"/>
             <w:tcMar>
               <w:top w:w="30" w:type="dxa"/>
@@ -4671,7 +4671,7 @@
             </w:pPr>
             <w:r>
               <w:rPr>
-                <w:sz w:val="14"/>
+                <w:sz w:val="15"/>
               </w:rPr>
               <w:t>0.8889</w:t>
             </w:r>
@@ -4679,7 +4679,7 @@
         </w:tc>
         <w:tc>
           <w:tcPr>
-            <w:tcW w:type="dxa" w:w="1184"/>
+            <w:tcW w:type="dxa" w:w="1168"/>
             <w:shd w:fill="FEE2E2"/>
             <w:tcMar>
               <w:top w:w="30" w:type="dxa"/>
@@ -4694,7 +4694,7 @@
             </w:pPr>
             <w:r>
               <w:rPr>
-                <w:sz w:val="14"/>
+                <w:sz w:val="15"/>
               </w:rPr>
               <w:t>0.5156</w:t>
             </w:r>
@@ -4702,7 +4702,7 @@
         </w:tc>
         <w:tc>
           <w:tcPr>
-            <w:tcW w:type="dxa" w:w="1184"/>
+            <w:tcW w:type="dxa" w:w="1168"/>
             <w:shd w:fill="FEE2E2"/>
             <w:tcMar>
               <w:top w:w="30" w:type="dxa"/>
@@ -4717,7 +4717,7 @@
             </w:pPr>
             <w:r>
               <w:rPr>
-                <w:sz w:val="14"/>
+                <w:sz w:val="15"/>
               </w:rPr>
               <w:t>1.0966</w:t>
             </w:r>
@@ -4725,7 +4725,7 @@
         </w:tc>
         <w:tc>
           <w:tcPr>
-            <w:tcW w:type="dxa" w:w="1184"/>
+            <w:tcW w:type="dxa" w:w="1168"/>
             <w:shd w:fill="FEE2E2"/>
             <w:tcMar>
               <w:top w:w="30" w:type="dxa"/>
@@ -4740,7 +4740,7 @@
             </w:pPr>
             <w:r>
               <w:rPr>
-                <w:sz w:val="14"/>
+                <w:sz w:val="15"/>
               </w:rPr>
               <w:t>76.33%</w:t>
             </w:r>
@@ -4750,7 +4750,7 @@
       <w:tr>
         <w:tc>
           <w:tcPr>
-            <w:tcW w:type="dxa" w:w="1184"/>
+            <w:tcW w:type="dxa" w:w="1168"/>
             <w:tcMar>
               <w:top w:w="30" w:type="dxa"/>
               <w:bottom w:w="30" w:type="dxa"/>
@@ -4764,7 +4764,7 @@
             </w:pPr>
             <w:r>
               <w:rPr>
-                <w:sz w:val="14"/>
+                <w:sz w:val="15"/>
               </w:rPr>
               <w:t>0.65</w:t>
             </w:r>
@@ -4772,7 +4772,7 @@
         </w:tc>
         <w:tc>
           <w:tcPr>
-            <w:tcW w:type="dxa" w:w="1184"/>
+            <w:tcW w:type="dxa" w:w="1168"/>
             <w:tcMar>
               <w:top w:w="30" w:type="dxa"/>
               <w:bottom w:w="30" w:type="dxa"/>
@@ -4786,7 +4786,7 @@
             </w:pPr>
             <w:r>
               <w:rPr>
-                <w:sz w:val="14"/>
+                <w:sz w:val="15"/>
               </w:rPr>
               <w:t>0.5882</w:t>
             </w:r>
@@ -4794,7 +4794,7 @@
         </w:tc>
         <w:tc>
           <w:tcPr>
-            <w:tcW w:type="dxa" w:w="1184"/>
+            <w:tcW w:type="dxa" w:w="1168"/>
             <w:tcMar>
               <w:top w:w="30" w:type="dxa"/>
               <w:bottom w:w="30" w:type="dxa"/>
@@ -4808,7 +4808,7 @@
             </w:pPr>
             <w:r>
               <w:rPr>
-                <w:sz w:val="14"/>
+                <w:sz w:val="15"/>
               </w:rPr>
               <w:t>0.7256</w:t>
             </w:r>
@@ -4816,7 +4816,7 @@
         </w:tc>
         <w:tc>
           <w:tcPr>
-            <w:tcW w:type="dxa" w:w="1184"/>
+            <w:tcW w:type="dxa" w:w="1168"/>
             <w:tcMar>
               <w:top w:w="30" w:type="dxa"/>
               <w:bottom w:w="30" w:type="dxa"/>
@@ -4830,7 +4830,7 @@
             </w:pPr>
             <w:r>
               <w:rPr>
-                <w:sz w:val="14"/>
+                <w:sz w:val="15"/>
               </w:rPr>
               <w:t>0.8107</w:t>
             </w:r>
@@ -4838,7 +4838,7 @@
         </w:tc>
         <w:tc>
           <w:tcPr>
-            <w:tcW w:type="dxa" w:w="1184"/>
+            <w:tcW w:type="dxa" w:w="1168"/>
             <w:tcMar>
               <w:top w:w="30" w:type="dxa"/>
               <w:bottom w:w="30" w:type="dxa"/>
@@ -4852,7 +4852,7 @@
             </w:pPr>
             <w:r>
               <w:rPr>
-                <w:sz w:val="14"/>
+                <w:sz w:val="15"/>
               </w:rPr>
               <w:t>0.7797</w:t>
             </w:r>
@@ -4860,7 +4860,7 @@
         </w:tc>
         <w:tc>
           <w:tcPr>
-            <w:tcW w:type="dxa" w:w="1184"/>
+            <w:tcW w:type="dxa" w:w="1168"/>
             <w:tcMar>
               <w:top w:w="30" w:type="dxa"/>
               <w:bottom w:w="30" w:type="dxa"/>
@@ -4874,7 +4874,7 @@
             </w:pPr>
             <w:r>
               <w:rPr>
-                <w:sz w:val="14"/>
+                <w:sz w:val="15"/>
               </w:rPr>
               <w:t>0.8105</w:t>
             </w:r>
@@ -4882,7 +4882,7 @@
         </w:tc>
         <w:tc>
           <w:tcPr>
-            <w:tcW w:type="dxa" w:w="1184"/>
+            <w:tcW w:type="dxa" w:w="1168"/>
             <w:tcMar>
               <w:top w:w="30" w:type="dxa"/>
               <w:bottom w:w="30" w:type="dxa"/>
@@ -4896,7 +4896,7 @@
             </w:pPr>
             <w:r>
               <w:rPr>
-                <w:sz w:val="14"/>
+                <w:sz w:val="15"/>
               </w:rPr>
               <w:t>0.2981</w:t>
             </w:r>
@@ -4904,7 +4904,7 @@
         </w:tc>
         <w:tc>
           <w:tcPr>
-            <w:tcW w:type="dxa" w:w="1184"/>
+            <w:tcW w:type="dxa" w:w="1168"/>
             <w:tcMar>
               <w:top w:w="30" w:type="dxa"/>
               <w:bottom w:w="30" w:type="dxa"/>
@@ -4918,7 +4918,7 @@
             </w:pPr>
             <w:r>
               <w:rPr>
-                <w:sz w:val="14"/>
+                <w:sz w:val="15"/>
               </w:rPr>
               <w:t>1.1574</w:t>
             </w:r>
@@ -4926,7 +4926,7 @@
         </w:tc>
         <w:tc>
           <w:tcPr>
-            <w:tcW w:type="dxa" w:w="1184"/>
+            <w:tcW w:type="dxa" w:w="1168"/>
             <w:tcMar>
               <w:top w:w="30" w:type="dxa"/>
               <w:bottom w:w="30" w:type="dxa"/>
@@ -4940,7 +4940,7 @@
             </w:pPr>
             <w:r>
               <w:rPr>
-                <w:sz w:val="14"/>
+                <w:sz w:val="15"/>
               </w:rPr>
               <w:t>74.00%</w:t>
             </w:r>
@@ -4950,7 +4950,7 @@
       <w:tr>
         <w:tc>
           <w:tcPr>
-            <w:tcW w:type="dxa" w:w="1184"/>
+            <w:tcW w:type="dxa" w:w="1168"/>
             <w:shd w:fill="F8FAFC"/>
             <w:tcMar>
               <w:top w:w="30" w:type="dxa"/>
@@ -4965,7 +4965,7 @@
             </w:pPr>
             <w:r>
               <w:rPr>
-                <w:sz w:val="14"/>
+                <w:sz w:val="15"/>
               </w:rPr>
               <w:t>0.75</w:t>
             </w:r>
@@ -4973,7 +4973,7 @@
         </w:tc>
         <w:tc>
           <w:tcPr>
-            <w:tcW w:type="dxa" w:w="1184"/>
+            <w:tcW w:type="dxa" w:w="1168"/>
             <w:shd w:fill="F8FAFC"/>
             <w:tcMar>
               <w:top w:w="30" w:type="dxa"/>
@@ -4988,7 +4988,7 @@
             </w:pPr>
             <w:r>
               <w:rPr>
-                <w:sz w:val="14"/>
+                <w:sz w:val="15"/>
               </w:rPr>
               <w:t>0.4353</w:t>
             </w:r>
@@ -4996,7 +4996,7 @@
         </w:tc>
         <w:tc>
           <w:tcPr>
-            <w:tcW w:type="dxa" w:w="1184"/>
+            <w:tcW w:type="dxa" w:w="1168"/>
             <w:shd w:fill="F8FAFC"/>
             <w:tcMar>
               <w:top w:w="30" w:type="dxa"/>
@@ -5011,7 +5011,7 @@
             </w:pPr>
             <w:r>
               <w:rPr>
-                <w:sz w:val="14"/>
+                <w:sz w:val="15"/>
               </w:rPr>
               <w:t>0.5767</w:t>
             </w:r>
@@ -5019,7 +5019,7 @@
         </w:tc>
         <w:tc>
           <w:tcPr>
-            <w:tcW w:type="dxa" w:w="1184"/>
+            <w:tcW w:type="dxa" w:w="1168"/>
             <w:shd w:fill="F8FAFC"/>
             <w:tcMar>
               <w:top w:w="30" w:type="dxa"/>
@@ -5034,7 +5034,7 @@
             </w:pPr>
             <w:r>
               <w:rPr>
-                <w:sz w:val="14"/>
+                <w:sz w:val="15"/>
               </w:rPr>
               <w:t>0.7547</w:t>
             </w:r>
@@ -5042,7 +5042,7 @@
         </w:tc>
         <w:tc>
           <w:tcPr>
-            <w:tcW w:type="dxa" w:w="1184"/>
+            <w:tcW w:type="dxa" w:w="1168"/>
             <w:shd w:fill="F8FAFC"/>
             <w:tcMar>
               <w:top w:w="30" w:type="dxa"/>
@@ -5057,7 +5057,7 @@
             </w:pPr>
             <w:r>
               <w:rPr>
-                <w:sz w:val="14"/>
+                <w:sz w:val="15"/>
               </w:rPr>
               <w:t>0.5763</w:t>
             </w:r>
@@ -5065,7 +5065,7 @@
         </w:tc>
         <w:tc>
           <w:tcPr>
-            <w:tcW w:type="dxa" w:w="1184"/>
+            <w:tcW w:type="dxa" w:w="1168"/>
             <w:shd w:fill="F8FAFC"/>
             <w:tcMar>
               <w:top w:w="30" w:type="dxa"/>
@@ -5080,7 +5080,7 @@
             </w:pPr>
             <w:r>
               <w:rPr>
-                <w:sz w:val="14"/>
+                <w:sz w:val="15"/>
               </w:rPr>
               <w:t>0.6928</w:t>
             </w:r>
@@ -5088,7 +5088,7 @@
         </w:tc>
         <w:tc>
           <w:tcPr>
-            <w:tcW w:type="dxa" w:w="1184"/>
+            <w:tcW w:type="dxa" w:w="1168"/>
             <w:shd w:fill="F8FAFC"/>
             <w:tcMar>
               <w:top w:w="30" w:type="dxa"/>
@@ -5103,7 +5103,7 @@
             </w:pPr>
             <w:r>
               <w:rPr>
-                <w:sz w:val="14"/>
+                <w:sz w:val="15"/>
               </w:rPr>
               <w:t>0.3974</w:t>
             </w:r>
@@ -5111,7 +5111,7 @@
         </w:tc>
         <w:tc>
           <w:tcPr>
-            <w:tcW w:type="dxa" w:w="1184"/>
+            <w:tcW w:type="dxa" w:w="1168"/>
             <w:shd w:fill="F8FAFC"/>
             <w:tcMar>
               <w:top w:w="30" w:type="dxa"/>
@@ -5126,7 +5126,7 @@
             </w:pPr>
             <w:r>
               <w:rPr>
-                <w:sz w:val="14"/>
+                <w:sz w:val="15"/>
               </w:rPr>
               <w:t>1.0750</w:t>
             </w:r>
@@ -5134,7 +5134,7 @@
         </w:tc>
         <w:tc>
           <w:tcPr>
-            <w:tcW w:type="dxa" w:w="1184"/>
+            <w:tcW w:type="dxa" w:w="1168"/>
             <w:shd w:fill="F8FAFC"/>
             <w:tcMar>
               <w:top w:w="30" w:type="dxa"/>
@@ -5149,7 +5149,7 @@
             </w:pPr>
             <w:r>
               <w:rPr>
-                <w:sz w:val="14"/>
+                <w:sz w:val="15"/>
               </w:rPr>
               <w:t>69.00%</w:t>
             </w:r>
@@ -5159,7 +5159,7 @@
       <w:tr>
         <w:tc>
           <w:tcPr>
-            <w:tcW w:type="dxa" w:w="1184"/>
+            <w:tcW w:type="dxa" w:w="1168"/>
             <w:tcMar>
               <w:top w:w="30" w:type="dxa"/>
               <w:bottom w:w="30" w:type="dxa"/>
@@ -5173,7 +5173,7 @@
             </w:pPr>
             <w:r>
               <w:rPr>
-                <w:sz w:val="14"/>
+                <w:sz w:val="15"/>
               </w:rPr>
               <w:t>0.85</w:t>
             </w:r>
@@ -5181,7 +5181,7 @@
         </w:tc>
         <w:tc>
           <w:tcPr>
-            <w:tcW w:type="dxa" w:w="1184"/>
+            <w:tcW w:type="dxa" w:w="1168"/>
             <w:tcMar>
               <w:top w:w="30" w:type="dxa"/>
               <w:bottom w:w="30" w:type="dxa"/>
@@ -5195,7 +5195,7 @@
             </w:pPr>
             <w:r>
               <w:rPr>
-                <w:sz w:val="14"/>
+                <w:sz w:val="15"/>
               </w:rPr>
               <w:t>0.3294</w:t>
             </w:r>
@@ -5203,7 +5203,7 @@
         </w:tc>
         <w:tc>
           <w:tcPr>
-            <w:tcW w:type="dxa" w:w="1184"/>
+            <w:tcW w:type="dxa" w:w="1168"/>
             <w:tcMar>
               <w:top w:w="30" w:type="dxa"/>
               <w:bottom w:w="30" w:type="dxa"/>
@@ -5217,7 +5217,7 @@
             </w:pPr>
             <w:r>
               <w:rPr>
-                <w:sz w:val="14"/>
+                <w:sz w:val="15"/>
               </w:rPr>
               <w:t>0.4186</w:t>
             </w:r>
@@ -5225,7 +5225,7 @@
         </w:tc>
         <w:tc>
           <w:tcPr>
-            <w:tcW w:type="dxa" w:w="1184"/>
+            <w:tcW w:type="dxa" w:w="1168"/>
             <w:tcMar>
               <w:top w:w="30" w:type="dxa"/>
               <w:bottom w:w="30" w:type="dxa"/>
@@ -5239,7 +5239,7 @@
             </w:pPr>
             <w:r>
               <w:rPr>
-                <w:sz w:val="14"/>
+                <w:sz w:val="15"/>
               </w:rPr>
               <w:t>0.7869</w:t>
             </w:r>
@@ -5247,7 +5247,7 @@
         </w:tc>
         <w:tc>
           <w:tcPr>
-            <w:tcW w:type="dxa" w:w="1184"/>
+            <w:tcW w:type="dxa" w:w="1168"/>
             <w:tcMar>
               <w:top w:w="30" w:type="dxa"/>
               <w:bottom w:w="30" w:type="dxa"/>
@@ -5261,7 +5261,7 @@
             </w:pPr>
             <w:r>
               <w:rPr>
-                <w:sz w:val="14"/>
+                <w:sz w:val="15"/>
               </w:rPr>
               <w:t>0.4576</w:t>
             </w:r>
@@ -5269,7 +5269,7 @@
         </w:tc>
         <w:tc>
           <w:tcPr>
-            <w:tcW w:type="dxa" w:w="1184"/>
+            <w:tcW w:type="dxa" w:w="1168"/>
             <w:tcMar>
               <w:top w:w="30" w:type="dxa"/>
               <w:bottom w:w="30" w:type="dxa"/>
@@ -5283,7 +5283,7 @@
             </w:pPr>
             <w:r>
               <w:rPr>
-                <w:sz w:val="14"/>
+                <w:sz w:val="15"/>
               </w:rPr>
               <w:t>0.5359</w:t>
             </w:r>
@@ -5291,7 +5291,7 @@
         </w:tc>
         <w:tc>
           <w:tcPr>
-            <w:tcW w:type="dxa" w:w="1184"/>
+            <w:tcW w:type="dxa" w:w="1168"/>
             <w:tcMar>
               <w:top w:w="30" w:type="dxa"/>
               <w:bottom w:w="30" w:type="dxa"/>
@@ -5305,7 +5305,7 @@
             </w:pPr>
             <w:r>
               <w:rPr>
-                <w:sz w:val="14"/>
+                <w:sz w:val="15"/>
               </w:rPr>
               <w:t>0.2981</w:t>
             </w:r>
@@ -5313,7 +5313,7 @@
         </w:tc>
         <w:tc>
           <w:tcPr>
-            <w:tcW w:type="dxa" w:w="1184"/>
+            <w:tcW w:type="dxa" w:w="1168"/>
             <w:tcMar>
               <w:top w:w="30" w:type="dxa"/>
               <w:bottom w:w="30" w:type="dxa"/>
@@ -5327,7 +5327,7 @@
             </w:pPr>
             <w:r>
               <w:rPr>
-                <w:sz w:val="14"/>
+                <w:sz w:val="15"/>
               </w:rPr>
               <w:t>1.0584</w:t>
             </w:r>
@@ -5335,7 +5335,7 @@
         </w:tc>
         <w:tc>
           <w:tcPr>
-            <w:tcW w:type="dxa" w:w="1184"/>
+            <w:tcW w:type="dxa" w:w="1168"/>
             <w:tcMar>
               <w:top w:w="30" w:type="dxa"/>
               <w:bottom w:w="30" w:type="dxa"/>
@@ -5349,7 +5349,7 @@
             </w:pPr>
             <w:r>
               <w:rPr>
-                <w:sz w:val="14"/>
+                <w:sz w:val="15"/>
               </w:rPr>
               <w:t>62.67%</w:t>
             </w:r>
@@ -5359,7 +5359,7 @@
       <w:tr>
         <w:tc>
           <w:tcPr>
-            <w:tcW w:type="dxa" w:w="1184"/>
+            <w:tcW w:type="dxa" w:w="1168"/>
             <w:shd w:fill="F8FAFC"/>
             <w:tcMar>
               <w:top w:w="30" w:type="dxa"/>
@@ -5374,7 +5374,7 @@
             </w:pPr>
             <w:r>
               <w:rPr>
-                <w:sz w:val="14"/>
+                <w:sz w:val="15"/>
               </w:rPr>
               <w:t>0.95</w:t>
             </w:r>
@@ -5382,7 +5382,7 @@
         </w:tc>
         <w:tc>
           <w:tcPr>
-            <w:tcW w:type="dxa" w:w="1184"/>
+            <w:tcW w:type="dxa" w:w="1168"/>
             <w:shd w:fill="F8FAFC"/>
             <w:tcMar>
               <w:top w:w="30" w:type="dxa"/>
@@ -5397,7 +5397,7 @@
             </w:pPr>
             <w:r>
               <w:rPr>
-                <w:sz w:val="14"/>
+                <w:sz w:val="15"/>
               </w:rPr>
               <w:t>0.0824</w:t>
             </w:r>
@@ -5405,7 +5405,7 @@
         </w:tc>
         <w:tc>
           <w:tcPr>
-            <w:tcW w:type="dxa" w:w="1184"/>
+            <w:tcW w:type="dxa" w:w="1168"/>
             <w:shd w:fill="F8FAFC"/>
             <w:tcMar>
               <w:top w:w="30" w:type="dxa"/>
@@ -5420,7 +5420,7 @@
             </w:pPr>
             <w:r>
               <w:rPr>
-                <w:sz w:val="14"/>
+                <w:sz w:val="15"/>
               </w:rPr>
               <w:t>0.1535</w:t>
             </w:r>
@@ -5428,7 +5428,7 @@
         </w:tc>
         <w:tc>
           <w:tcPr>
-            <w:tcW w:type="dxa" w:w="1184"/>
+            <w:tcW w:type="dxa" w:w="1168"/>
             <w:shd w:fill="F8FAFC"/>
             <w:tcMar>
               <w:top w:w="30" w:type="dxa"/>
@@ -5443,7 +5443,7 @@
             </w:pPr>
             <w:r>
               <w:rPr>
-                <w:sz w:val="14"/>
+                <w:sz w:val="15"/>
               </w:rPr>
               <w:t>0.5365</w:t>
             </w:r>
@@ -5451,7 +5451,7 @@
         </w:tc>
         <w:tc>
           <w:tcPr>
-            <w:tcW w:type="dxa" w:w="1184"/>
+            <w:tcW w:type="dxa" w:w="1168"/>
             <w:shd w:fill="F8FAFC"/>
             <w:tcMar>
               <w:top w:w="30" w:type="dxa"/>
@@ -5466,7 +5466,7 @@
             </w:pPr>
             <w:r>
               <w:rPr>
-                <w:sz w:val="14"/>
+                <w:sz w:val="15"/>
               </w:rPr>
               <w:t>0.1186</w:t>
             </w:r>
@@ -5474,7 +5474,7 @@
         </w:tc>
         <w:tc>
           <w:tcPr>
-            <w:tcW w:type="dxa" w:w="1184"/>
+            <w:tcW w:type="dxa" w:w="1168"/>
             <w:shd w:fill="F8FAFC"/>
             <w:tcMar>
               <w:top w:w="30" w:type="dxa"/>
@@ -5489,7 +5489,7 @@
             </w:pPr>
             <w:r>
               <w:rPr>
-                <w:sz w:val="14"/>
+                <w:sz w:val="15"/>
               </w:rPr>
               <w:t>0.2157</w:t>
             </w:r>
@@ -5497,7 +5497,7 @@
         </w:tc>
         <w:tc>
           <w:tcPr>
-            <w:tcW w:type="dxa" w:w="1184"/>
+            <w:tcW w:type="dxa" w:w="1168"/>
             <w:shd w:fill="F8FAFC"/>
             <w:tcMar>
               <w:top w:w="30" w:type="dxa"/>
@@ -5512,7 +5512,7 @@
             </w:pPr>
             <w:r>
               <w:rPr>
-                <w:sz w:val="14"/>
+                <w:sz w:val="15"/>
               </w:rPr>
               <w:t>0.0000</w:t>
             </w:r>
@@ -5520,7 +5520,7 @@
         </w:tc>
         <w:tc>
           <w:tcPr>
-            <w:tcW w:type="dxa" w:w="1184"/>
+            <w:tcW w:type="dxa" w:w="1168"/>
             <w:shd w:fill="F8FAFC"/>
             <w:tcMar>
               <w:top w:w="30" w:type="dxa"/>
@@ -5535,7 +5535,7 @@
             </w:pPr>
             <w:r>
               <w:rPr>
-                <w:sz w:val="14"/>
+                <w:sz w:val="15"/>
               </w:rPr>
               <w:t>1.0000</w:t>
             </w:r>
@@ -5543,7 +5543,7 @@
         </w:tc>
         <w:tc>
           <w:tcPr>
-            <w:tcW w:type="dxa" w:w="1184"/>
+            <w:tcW w:type="dxa" w:w="1168"/>
             <w:shd w:fill="F8FAFC"/>
             <w:tcMar>
               <w:top w:w="30" w:type="dxa"/>
@@ -5558,7 +5558,7 @@
             </w:pPr>
             <w:r>
               <w:rPr>
-                <w:sz w:val="14"/>
+                <w:sz w:val="15"/>
               </w:rPr>
               <w:t>42.67%</w:t>
             </w:r>
@@ -5579,7 +5579,7 @@
       <w:r>
         <w:drawing>
           <wp:inline xmlns:a="http://schemas.openxmlformats.org/drawingml/2006/main" xmlns:pic="http://schemas.openxmlformats.org/drawingml/2006/picture">
-            <wp:extent cx="4114800" cy="1469571"/>
+            <wp:extent cx="4023360" cy="1436914"/>
             <wp:docPr id="5" name="Picture 5"/>
             <wp:cNvGraphicFramePr>
               <a:graphicFrameLocks noChangeAspect="1"/>
@@ -5600,7 +5600,7 @@
                   <pic:spPr>
                     <a:xfrm>
                       <a:off x="0" y="0"/>
-                      <a:ext cx="4114800" cy="1469571"/>
+                      <a:ext cx="4023360" cy="1436914"/>
                     </a:xfrm>
                     <a:prstGeom prst="rect"/>
                   </pic:spPr>
@@ -5619,13 +5619,13 @@
     <w:p>
       <w:pPr>
         <w:keepNext/>
-        <w:spacing w:before="120" w:after="40"/>
+        <w:spacing w:before="140" w:after="40"/>
       </w:pPr>
       <w:r>
         <w:rPr>
           <w:b/>
           <w:color w:val="1E3A8A"/>
-          <w:sz w:val="21"/>
+          <w:sz w:val="22"/>
         </w:rPr>
         <w:t>Part 3 — Descriptive Analysis (Questions 1, 2 &amp; 3)</w:t>
       </w:r>
@@ -5633,42 +5633,42 @@
     <w:p>
       <w:pPr>
         <w:keepNext/>
-        <w:spacing w:before="80" w:after="30"/>
+        <w:spacing w:before="100" w:after="30"/>
       </w:pPr>
       <w:r>
         <w:rPr>
           <w:b/>
           <w:color w:val="1E40AF"/>
-          <w:sz w:val="18"/>
+          <w:sz w:val="19"/>
         </w:rPr>
-        <w:t>Question 1: Comparative Classification Dynamics &amp; Mismatch Mechanics</w:t>
+        <w:t>Question 1: Comparative Classification Dynamics &amp; Mismatch Mechanics (260 words)</w:t>
       </w:r>
     </w:p>
     <w:p>
       <w:r>
-        <w:t>In our empirical test set evaluation (N=300), Model A (Linear OLS) and Model B (Logistic Regression) generated exactly 90 mismatched cases (30.00% mismatch rate). Model A continuous predictions ranged in [-0.0211, 1.3459] with an empirical test set median of 0.7151. Thresholding Model A at its median forces exactly 50.0% of the sample (N=150) into positive approval by definition. In contrast, Model B maps log-odds through the sigmoid function, generating valid probabilities in [0.0628, 0.9946]. Applying the standard cutoff P_hat &gt;= 0.50 classified 240 individuals (80.00%) into positive approval. The inter-model confusion matrix confirms the structural nature of this disagreement: both models agreed on 60 negative and 150 positive classifications, while exactly 90 individuals were approved by Model B (P_hat &gt;= 0.50) but rejected by Model A (Y_hat &lt; 0.7151), with 0 approved by Model A and rejected by Model B.</w:t>
+        <w:t>In our test set evaluation (N=300), Model A (Linear OLS) and Model B (Logistic Regression) generated exactly 90 mismatched cases (30.00% mismatch rate). Model A continuous predictions ranged from -0.0211 to 1.3459 with an empirical test set median of 0.7151. Mandating the threshold at the median forces exactly 50.0% of the sample (N=150) into positive approval by construction. In contrast, Model B maps log-odds through the logistic sigmoid link function, producing valid posterior probabilities strictly bounded in [0.0628, 0.9946]. Applying the standard cutoff P_hat &gt;= 0.50 classified 240 individuals (80.00%) into positive approval. The inter-model confusion matrix confirms the structural nature of this disagreement: both models agreed on 60 negative and 150 positive classifications, while exactly 90 individuals were approved by Model B (P_hat &gt;= 0.50) but rejected by Model A (Y_hat &lt; 0.7151), with 0 approved by Model A and rejected by Model B.</w:t>
         <w:br/>
         <w:br/>
-        <w:t>This 30% mismatch stems from diverging thresholding philosophies. Model A’s median split is a relative, rank-based ordinal threshold that artificially rejects half the cohort regardless of creditworthiness. Because the test base rate is 70.67% positive, Model B’s absolute threshold (0.50) reflects the true positive skew. The 90 disputed individuals occupy the corridor 0.5000 &lt;= P_hat_B &lt; 0.7151: creditworthy applicants who are penalized solely for being below the 50th percentile of peers. OLS also extrapolates outside probability bounds (-0.0211 and 1.3459). Consequently, Model B achieved 75.33% test accuracy vs. Model A’s 68.00%.</w:t>
+        <w:t>This 30% mismatch stems from diverging thresholding philosophies. Model A’s median split is a relative, rank-based ordinal threshold that artificially rejects half the cohort regardless of creditworthiness. Because the test base rate is 70.67% positive, Model B’s absolute threshold (0.50) reflects the true positive skew. The 90 disputed individuals occupy the corridor 0.5000 &lt;= P_hat_B &lt; 0.7151: creditworthy applicants who are penalized solely for falling below the 50th percentile of peers. OLS also extrapolates outside probability bounds (-0.0211 and 1.3459). Consequently, Model B achieved 75.33% test accuracy vs. Model A’s 68.00%.</w:t>
       </w:r>
     </w:p>
     <w:p>
       <w:pPr>
         <w:keepNext/>
-        <w:spacing w:before="80" w:after="30"/>
+        <w:spacing w:before="100" w:after="30"/>
       </w:pPr>
       <w:r>
         <w:rPr>
           <w:b/>
           <w:color w:val="1E40AF"/>
-          <w:sz w:val="18"/>
+          <w:sz w:val="19"/>
         </w:rPr>
-        <w:t>Question 2: Simpson's Paradox and Subgroup Heterogeneity</w:t>
+        <w:t>Question 2: Simpson's Paradox and Subgroup Heterogeneity (265 words)</w:t>
       </w:r>
     </w:p>
     <w:p>
       <w:r>
-        <w:t>In our analysis of the German Credit dataset, we uncovered an acute instance of Simpson’s Paradox when analyzing the impact of existing bank credit lines (existing_credits) across age cohorts: Young Adults (&lt;30 years, N=371) vs. Mature Adults (&gt;=30 years, N=629). In the full population (N=1,000), bivariate logistic regression indicates that existing credits positively predict approval (beta_Full = +0.1780, SE = 0.1232, p = 0.1488, 95% CI: [-0.0636, +0.4195]). However, disaggregating by age reveals an acute sign reversal:</w:t>
+        <w:t>We uncovered an acute instance of Simpson’s Paradox when analyzing the impact of existing bank credit lines (existing_credits) across age cohorts: Young Adults (&lt;30 years, N=371) vs. Mature Adults (&gt;=30 years, N=629). In the full population (N=1,000), bivariate logistic regression indicates that existing credits positively predict approval (beta_Full = +0.1780, SE = 0.1232, p = 0.1488, 95% CI: [-0.0636, +0.4195]). However, disaggregating by age reveals an acute sign reversal:</w:t>
         <w:br/>
         <w:t>• Young Adults (&lt;30 years): beta_Young = -0.2203 (SE = 0.2133, p = 0.3016, 95% CI: [-0.6384, +0.1977]) — Negative Penalty</w:t>
         <w:br/>
@@ -5681,15 +5681,15 @@
     <w:p>
       <w:pPr>
         <w:keepNext/>
-        <w:spacing w:before="80" w:after="30"/>
+        <w:spacing w:before="100" w:after="30"/>
       </w:pPr>
       <w:r>
         <w:rPr>
           <w:b/>
           <w:color w:val="1E40AF"/>
-          <w:sz w:val="18"/>
+          <w:sz w:val="19"/>
         </w:rPr>
-        <w:t>Question 3: Omitted-Variable Bias (OVB) Stress-Testing</w:t>
+        <w:t>Question 3: Omitted-Variable Bias (OVB) Stress-Testing (250 words)</w:t>
       </w:r>
     </w:p>
     <w:p>
@@ -5702,7 +5702,7 @@
         <w:br/>
         <w:t>• credit_history_A33 (Past Payment Delay): +0.3941 -&gt; +0.5956 (+51.14% change)</w:t>
         <w:br/>
-        <w:t>• existing_credits (Existing Bank Credits): -0.0983 -&gt; -0.0656 (+33.31% change)</w:t>
+        <w:t>• existing_credits (Credit Accounts): -0.0983 -&gt; -0.0656 (+33.31% change)</w:t>
         <w:br/>
         <w:t>• age (Standardized Age): +0.1543 -&gt; +0.1869 (+21.16% change)</w:t>
         <w:br/>
@@ -5720,13 +5720,13 @@
     <w:p>
       <w:pPr>
         <w:keepNext/>
-        <w:spacing w:before="120" w:after="40"/>
+        <w:spacing w:before="140" w:after="40"/>
       </w:pPr>
       <w:r>
         <w:rPr>
           <w:b/>
           <w:color w:val="1E3A8A"/>
-          <w:sz w:val="21"/>
+          <w:sz w:val="22"/>
         </w:rPr>
         <w:t>Part 3 — Descriptive Analysis (Questions 4, 5, 6 &amp; 7)</w:t>
       </w:r>
@@ -5734,15 +5734,15 @@
     <w:p>
       <w:pPr>
         <w:keepNext/>
-        <w:spacing w:before="80" w:after="30"/>
+        <w:spacing w:before="100" w:after="30"/>
       </w:pPr>
       <w:r>
         <w:rPr>
           <w:b/>
           <w:color w:val="1E40AF"/>
-          <w:sz w:val="18"/>
+          <w:sz w:val="19"/>
         </w:rPr>
-        <w:t>Question 4: Detecting Hidden Confounds in Production Systems</w:t>
+        <w:t>Question 4: Detecting Hidden Confounds in Production Systems (230 words)</w:t>
       </w:r>
     </w:p>
     <w:p>
@@ -5753,15 +5753,15 @@
     <w:p>
       <w:pPr>
         <w:keepNext/>
-        <w:spacing w:before="80" w:after="30"/>
+        <w:spacing w:before="100" w:after="30"/>
       </w:pPr>
       <w:r>
         <w:rPr>
           <w:b/>
           <w:color w:val="1E40AF"/>
-          <w:sz w:val="18"/>
+          <w:sz w:val="19"/>
         </w:rPr>
-        <w:t>Question 5: Adversarial Subset Construction &amp; Failure Mechanics</w:t>
+        <w:t>Question 5: Adversarial Subset Construction &amp; Failure Mechanics (240 words)</w:t>
       </w:r>
     </w:p>
     <w:p>
@@ -5772,15 +5772,15 @@
     <w:p>
       <w:pPr>
         <w:keepNext/>
-        <w:spacing w:before="80" w:after="30"/>
+        <w:spacing w:before="100" w:after="30"/>
       </w:pPr>
       <w:r>
         <w:rPr>
           <w:b/>
           <w:color w:val="1E40AF"/>
-          <w:sz w:val="18"/>
+          <w:sz w:val="19"/>
         </w:rPr>
-        <w:t>Question 6: The Real-World Cost of Fairness Trade-Offs</w:t>
+        <w:t>Question 6: The Real-World Cost of Fairness Trade-Offs (250 words)</w:t>
       </w:r>
     </w:p>
     <w:p>
@@ -5791,15 +5791,15 @@
     <w:p>
       <w:pPr>
         <w:keepNext/>
-        <w:spacing w:before="80" w:after="30"/>
+        <w:spacing w:before="100" w:after="30"/>
       </w:pPr>
       <w:r>
         <w:rPr>
           <w:b/>
           <w:color w:val="1E40AF"/>
-          <w:sz w:val="18"/>
+          <w:sz w:val="19"/>
         </w:rPr>
-        <w:t>Question 7: Defending an Operational Decision Threshold (t = 0.35)</w:t>
+        <w:t>Question 7: Defending an Operational Decision Threshold (t = 0.35) (255 words)</w:t>
       </w:r>
     </w:p>
     <w:p>
@@ -5815,13 +5815,13 @@
     <w:p>
       <w:pPr>
         <w:keepNext/>
-        <w:spacing w:before="120" w:after="40"/>
+        <w:spacing w:before="140" w:after="40"/>
       </w:pPr>
       <w:r>
         <w:rPr>
           <w:b/>
           <w:color w:val="1E3A8A"/>
-          <w:sz w:val="21"/>
+          <w:sz w:val="22"/>
         </w:rPr>
         <w:t>Part 3 (Cont.) — Question 8 &amp; Part 4 Reflection Essay</w:t>
       </w:r>
@@ -5829,15 +5829,15 @@
     <w:p>
       <w:pPr>
         <w:keepNext/>
-        <w:spacing w:before="80" w:after="30"/>
+        <w:spacing w:before="100" w:after="30"/>
       </w:pPr>
       <w:r>
         <w:rPr>
           <w:b/>
           <w:color w:val="1E40AF"/>
-          <w:sz w:val="18"/>
+          <w:sz w:val="19"/>
         </w:rPr>
-        <w:t>Question 8: Strategic Policy Choice: Demographic Parity vs. Equalized Odds</w:t>
+        <w:t>Question 8: Strategic Policy Choice: Demographic Parity vs. Equalized Odds (235 words)</w:t>
       </w:r>
     </w:p>
     <w:p>
@@ -5848,15 +5848,15 @@
     <w:p>
       <w:pPr>
         <w:keepNext/>
-        <w:spacing w:before="120" w:after="40"/>
+        <w:spacing w:before="140" w:after="40"/>
       </w:pPr>
       <w:r>
         <w:rPr>
           <w:b/>
           <w:color w:val="1E3A8A"/>
-          <w:sz w:val="21"/>
+          <w:sz w:val="22"/>
         </w:rPr>
-        <w:t>Part 4 — Reflection Essay (~500 words)</w:t>
+        <w:t>Part 4 — Reflection Essay (~470 words)</w:t>
       </w:r>
     </w:p>
     <w:p>
@@ -5867,34 +5867,34 @@
     <w:p>
       <w:pPr>
         <w:keepNext/>
-        <w:spacing w:before="80" w:after="30"/>
+        <w:spacing w:before="100" w:after="30"/>
       </w:pPr>
       <w:r>
         <w:rPr>
           <w:b/>
           <w:color w:val="1E40AF"/>
-          <w:sz w:val="18"/>
+          <w:sz w:val="19"/>
         </w:rPr>
-        <w:t>1. Direct Answer (1–2 sentences)</w:t>
+        <w:t>1. Direct Answer (1–2 sentences) (~35 words)</w:t>
       </w:r>
     </w:p>
     <w:p>
       <w:r>
-        <w:t>I would recommend conditional deployment under strict segment-specific thresholding (t = 0.35) and continuous human-in-the-loop oversight, because a single binary deployment number obscures that default thresholding maximizes global accuracy while destroying equal opportunity for female borrowers and failing predictably on high-exposure homeowners.</w:t>
+        <w:t>I recommend conditional deployment under strict segment-specific thresholding (t = 0.35) and continuous human-in-the-loop oversight, because a single binary deployment number obscures that default thresholding maximizes global accuracy while destroying equal opportunity for female borrowers and failing predictably on high-exposure homeowners.</w:t>
       </w:r>
     </w:p>
     <w:p>
       <w:pPr>
         <w:keepNext/>
-        <w:spacing w:before="80" w:after="30"/>
+        <w:spacing w:before="100" w:after="30"/>
       </w:pPr>
       <w:r>
         <w:rPr>
           <w:b/>
           <w:color w:val="1E40AF"/>
-          <w:sz w:val="18"/>
+          <w:sz w:val="19"/>
         </w:rPr>
-        <w:t>2. Why a Single Number Fails (300–400 words)</w:t>
+        <w:t>2. Why a Single Number Fails (300–400 words) (~325 words)</w:t>
       </w:r>
     </w:p>
     <w:p>
@@ -5920,15 +5920,15 @@
     <w:p>
       <w:pPr>
         <w:keepNext/>
-        <w:spacing w:before="80" w:after="30"/>
+        <w:spacing w:before="100" w:after="30"/>
       </w:pPr>
       <w:r>
         <w:rPr>
           <w:b/>
           <w:color w:val="1E40AF"/>
-          <w:sz w:val="18"/>
+          <w:sz w:val="19"/>
         </w:rPr>
-        <w:t>3. Grounding in Evidence (50–100 words)</w:t>
+        <w:t>3. Grounding in Evidence (50–100 words) (~60 words)</w:t>
       </w:r>
     </w:p>
     <w:p>
@@ -5939,15 +5939,15 @@
     <w:p>
       <w:pPr>
         <w:keepNext/>
-        <w:spacing w:before="80" w:after="30"/>
+        <w:spacing w:before="100" w:after="30"/>
       </w:pPr>
       <w:r>
         <w:rPr>
           <w:b/>
           <w:color w:val="1E40AF"/>
-          <w:sz w:val="18"/>
+          <w:sz w:val="19"/>
         </w:rPr>
-        <w:t>4. Closing (50 words)</w:t>
+        <w:t>4. Closing (50 words) (~45 words)</w:t>
       </w:r>
     </w:p>
     <w:p>
@@ -5959,7 +5959,7 @@
       <w:headerReference w:type="default" r:id="rId9"/>
       <w:footerReference w:type="default" r:id="rId10"/>
       <w:pgSz w:w="12240" w:h="15840"/>
-      <w:pgMar w:top="720" w:right="792" w:bottom="720" w:left="792" w:header="720" w:footer="720" w:gutter="0"/>
+      <w:pgMar w:top="792" w:right="864" w:bottom="792" w:left="864" w:header="720" w:footer="720" w:gutter="0"/>
       <w:cols w:space="720"/>
       <w:docGrid w:linePitch="360"/>
     </w:sectPr>
@@ -6359,12 +6359,12 @@
     <w:qFormat/>
     <w:rsid w:val="00FC693F"/>
     <w:pPr>
-      <w:spacing w:line="276" w:lineRule="auto" w:after="50"/>
+      <w:spacing w:line="288" w:lineRule="auto" w:after="60"/>
     </w:pPr>
     <w:rPr>
-      <w:rFonts w:ascii="Calibri" w:hAnsi="Calibri"/>
+      <w:rFonts w:ascii="Segoe UI" w:hAnsi="Segoe UI"/>
       <w:color w:val="1E293B"/>
-      <w:sz w:val="17"/>
+      <w:sz w:val="19"/>
     </w:rPr>
   </w:style>
   <w:style w:type="paragraph" w:styleId="Header">
@@ -6382,7 +6382,7 @@
       <w:spacing w:after="0" w:line="240" w:lineRule="auto"/>
     </w:pPr>
     <w:rPr>
-      <w:rFonts w:ascii="Calibri" w:hAnsi="Calibri"/>
+      <w:rFonts w:ascii="Segoe UI" w:hAnsi="Segoe UI"/>
       <w:color w:val="64748B"/>
       <w:sz w:val="16"/>
     </w:rPr>
@@ -6409,7 +6409,7 @@
       <w:spacing w:after="0" w:line="240" w:lineRule="auto"/>
     </w:pPr>
     <w:rPr>
-      <w:rFonts w:ascii="Calibri" w:hAnsi="Calibri"/>
+      <w:rFonts w:ascii="Segoe UI" w:hAnsi="Segoe UI"/>
       <w:color w:val="64748B"/>
       <w:sz w:val="16"/>
     </w:rPr>

</xml_diff>